<commit_message>
fix headers in report
</commit_message>
<xml_diff>
--- a/ai_11/sviatoslav_davydovych/epic_3/epic_3_report_sviatoslav_davydovych.docx
+++ b/ai_11/sviatoslav_davydovych/epic_3/epic_3_report_sviatoslav_davydovych.docx
@@ -104,12 +104,12 @@
             <wp:extent cx="2710845" cy="2571750"/>
             <wp:effectExtent b="0" l="0" r="0" t="0"/>
             <wp:wrapNone/>
-            <wp:docPr descr="A blue and white logo&#10;&#10;Description automatically generated" id="26" name="image13.jpg"/>
+            <wp:docPr descr="A blue and white logo&#10;&#10;Description automatically generated" id="25" name="image25.jpg"/>
             <a:graphic>
               <a:graphicData uri="http://schemas.openxmlformats.org/drawingml/2006/picture">
                 <pic:pic>
                   <pic:nvPicPr>
-                    <pic:cNvPr descr="A blue and white logo&#10;&#10;Description automatically generated" id="0" name="image13.jpg"/>
+                    <pic:cNvPr descr="A blue and white logo&#10;&#10;Description automatically generated" id="0" name="image25.jpg"/>
                     <pic:cNvPicPr preferRelativeResize="0"/>
                   </pic:nvPicPr>
                   <pic:blipFill>
@@ -2864,30 +2864,25 @@
     <w:p>
       <w:pPr>
         <w:numPr>
-          <w:ilvl w:val="2"/>
+          <w:ilvl w:val="1"/>
           <w:numId w:val="3"/>
         </w:numPr>
         <w:spacing w:after="0" w:line="240" w:lineRule="auto"/>
-        <w:ind w:left="2160" w:hanging="360"/>
-        <w:rPr>
-          <w:rFonts w:ascii="Times New Roman" w:cs="Times New Roman" w:eastAsia="Times New Roman" w:hAnsi="Times New Roman"/>
+        <w:ind w:left="1440" w:hanging="360"/>
+        <w:rPr>
           <w:sz w:val="24"/>
           <w:szCs w:val="24"/>
         </w:rPr>
       </w:pPr>
-      <w:hyperlink r:id="rId13">
-        <w:r>
-          <w:rPr>
-            <w:rFonts w:ascii="Times New Roman" w:cs="Times New Roman" w:eastAsia="Times New Roman" w:hAnsi="Times New Roman"/>
-            <w:color w:val="1155cc"/>
-            <w:sz w:val="24"/>
-            <w:szCs w:val="24"/>
-            <w:u w:val="single"/>
-            <w:rtl w:val="0"/>
-          </w:rPr>
-          <w:t xml:space="preserve">Git and GitHub for Beginners - Crash Course</w:t>
-        </w:r>
-      </w:hyperlink>
+      <w:r>
+        <w:rPr>
+          <w:rFonts w:ascii="Times New Roman" w:cs="Times New Roman" w:eastAsia="Times New Roman" w:hAnsi="Times New Roman"/>
+          <w:sz w:val="24"/>
+          <w:szCs w:val="24"/>
+          <w:rtl w:val="0"/>
+        </w:rPr>
+        <w:t xml:space="preserve">Що опрацьовано:</w:t>
+      </w:r>
       <w:r>
         <w:rPr>
           <w:rtl w:val="0"/>
@@ -2903,29 +2898,111 @@
         <w:spacing w:after="0" w:line="240" w:lineRule="auto"/>
         <w:ind w:left="2160" w:hanging="360"/>
         <w:rPr>
+          <w:sz w:val="24"/>
+          <w:szCs w:val="24"/>
+        </w:rPr>
+      </w:pPr>
+      <w:r>
+        <w:rPr>
+          <w:rFonts w:ascii="Times New Roman" w:cs="Times New Roman" w:eastAsia="Times New Roman" w:hAnsi="Times New Roman"/>
+          <w:sz w:val="24"/>
+          <w:szCs w:val="24"/>
+          <w:rtl w:val="0"/>
+        </w:rPr>
+        <w:t xml:space="preserve">Пошук, екстремуми, обхід, сортування, видалення та додавання елементів</w:t>
+      </w:r>
+    </w:p>
+    <w:p>
+      <w:pPr>
+        <w:numPr>
+          <w:ilvl w:val="2"/>
+          <w:numId w:val="3"/>
+        </w:numPr>
+        <w:spacing w:after="0" w:line="240" w:lineRule="auto"/>
+        <w:ind w:left="2160" w:hanging="360"/>
+        <w:rPr>
           <w:rFonts w:ascii="Times New Roman" w:cs="Times New Roman" w:eastAsia="Times New Roman" w:hAnsi="Times New Roman"/>
           <w:sz w:val="24"/>
           <w:szCs w:val="24"/>
           <w:u w:val="none"/>
         </w:rPr>
       </w:pPr>
-      <w:hyperlink r:id="rId14">
-        <w:r>
-          <w:rPr>
-            <w:rFonts w:ascii="Times New Roman" w:cs="Times New Roman" w:eastAsia="Times New Roman" w:hAnsi="Times New Roman"/>
-            <w:color w:val="1155cc"/>
-            <w:sz w:val="24"/>
-            <w:szCs w:val="24"/>
-            <w:u w:val="single"/>
-            <w:rtl w:val="0"/>
-          </w:rPr>
-          <w:t xml:space="preserve">GitHub docs</w:t>
-        </w:r>
-      </w:hyperlink>
-      <w:r>
-        <w:rPr>
-          <w:rtl w:val="0"/>
-        </w:rPr>
+      <w:r>
+        <w:rPr>
+          <w:rFonts w:ascii="Times New Roman" w:cs="Times New Roman" w:eastAsia="Times New Roman" w:hAnsi="Times New Roman"/>
+          <w:sz w:val="24"/>
+          <w:szCs w:val="24"/>
+          <w:rtl w:val="0"/>
+        </w:rPr>
+        <w:t xml:space="preserve">Реалізація лінійного та двійкового пошуку</w:t>
+      </w:r>
+    </w:p>
+    <w:p>
+      <w:pPr>
+        <w:numPr>
+          <w:ilvl w:val="2"/>
+          <w:numId w:val="3"/>
+        </w:numPr>
+        <w:spacing w:after="0" w:line="240" w:lineRule="auto"/>
+        <w:ind w:left="2160" w:hanging="360"/>
+        <w:rPr>
+          <w:rFonts w:ascii="Times New Roman" w:cs="Times New Roman" w:eastAsia="Times New Roman" w:hAnsi="Times New Roman"/>
+          <w:sz w:val="24"/>
+          <w:szCs w:val="24"/>
+          <w:u w:val="none"/>
+        </w:rPr>
+      </w:pPr>
+      <w:r>
+        <w:rPr>
+          <w:rFonts w:ascii="Times New Roman" w:cs="Times New Roman" w:eastAsia="Times New Roman" w:hAnsi="Times New Roman"/>
+          <w:sz w:val="24"/>
+          <w:szCs w:val="24"/>
+          <w:rtl w:val="0"/>
+        </w:rPr>
+        <w:t xml:space="preserve">Базові алгоритми сортування: бульбашкове, вибором, вставками</w:t>
+      </w:r>
+    </w:p>
+    <w:p>
+      <w:pPr>
+        <w:numPr>
+          <w:ilvl w:val="2"/>
+          <w:numId w:val="3"/>
+        </w:numPr>
+        <w:spacing w:after="0" w:line="240" w:lineRule="auto"/>
+        <w:ind w:left="2160" w:hanging="360"/>
+        <w:rPr>
+          <w:rFonts w:ascii="Times New Roman" w:cs="Times New Roman" w:eastAsia="Times New Roman" w:hAnsi="Times New Roman"/>
+          <w:sz w:val="24"/>
+          <w:szCs w:val="24"/>
+          <w:u w:val="none"/>
+        </w:rPr>
+      </w:pPr>
+      <w:r>
+        <w:rPr>
+          <w:rFonts w:ascii="Times New Roman" w:cs="Times New Roman" w:eastAsia="Times New Roman" w:hAnsi="Times New Roman"/>
+          <w:sz w:val="24"/>
+          <w:szCs w:val="24"/>
+          <w:rtl w:val="0"/>
+        </w:rPr>
+        <w:t xml:space="preserve">Ефективні методи: </w:t>
+      </w:r>
+      <w:r>
+        <w:rPr>
+          <w:rFonts w:ascii="Times New Roman" w:cs="Times New Roman" w:eastAsia="Times New Roman" w:hAnsi="Times New Roman"/>
+          <w:sz w:val="24"/>
+          <w:szCs w:val="24"/>
+          <w:rtl w:val="0"/>
+        </w:rPr>
+        <w:t xml:space="preserve">MergeSort</w:t>
+      </w:r>
+      <w:r>
+        <w:rPr>
+          <w:rFonts w:ascii="Times New Roman" w:cs="Times New Roman" w:eastAsia="Times New Roman" w:hAnsi="Times New Roman"/>
+          <w:sz w:val="24"/>
+          <w:szCs w:val="24"/>
+          <w:rtl w:val="0"/>
+        </w:rPr>
+        <w:t xml:space="preserve">, QuickSort, сортування підрахунком</w:t>
       </w:r>
     </w:p>
     <w:p>
@@ -2948,7 +3025,119 @@
           <w:szCs w:val="24"/>
           <w:rtl w:val="0"/>
         </w:rPr>
-        <w:t xml:space="preserve">Що опрацьовано:</w:t>
+        <w:t xml:space="preserve">Статус: Ознайомлений</w:t>
+      </w:r>
+      <w:r>
+        <w:rPr>
+          <w:rtl w:val="0"/>
+        </w:rPr>
+      </w:r>
+    </w:p>
+    <w:p>
+      <w:pPr>
+        <w:numPr>
+          <w:ilvl w:val="1"/>
+          <w:numId w:val="3"/>
+        </w:numPr>
+        <w:spacing w:after="0" w:line="240" w:lineRule="auto"/>
+        <w:ind w:left="1440" w:hanging="360"/>
+        <w:rPr>
+          <w:sz w:val="24"/>
+          <w:szCs w:val="24"/>
+        </w:rPr>
+      </w:pPr>
+      <w:r>
+        <w:rPr>
+          <w:rFonts w:ascii="Times New Roman" w:cs="Times New Roman" w:eastAsia="Times New Roman" w:hAnsi="Times New Roman"/>
+          <w:sz w:val="24"/>
+          <w:szCs w:val="24"/>
+          <w:rtl w:val="0"/>
+        </w:rPr>
+        <w:t xml:space="preserve">Початок опрацювання теми: 02.10</w:t>
+      </w:r>
+      <w:r>
+        <w:rPr>
+          <w:rtl w:val="0"/>
+        </w:rPr>
+      </w:r>
+    </w:p>
+    <w:p>
+      <w:pPr>
+        <w:numPr>
+          <w:ilvl w:val="1"/>
+          <w:numId w:val="3"/>
+        </w:numPr>
+        <w:spacing w:after="0" w:line="240" w:lineRule="auto"/>
+        <w:ind w:left="1440" w:hanging="360"/>
+        <w:rPr>
+          <w:sz w:val="24"/>
+          <w:szCs w:val="24"/>
+        </w:rPr>
+      </w:pPr>
+      <w:r>
+        <w:rPr>
+          <w:rFonts w:ascii="Times New Roman" w:cs="Times New Roman" w:eastAsia="Times New Roman" w:hAnsi="Times New Roman"/>
+          <w:sz w:val="24"/>
+          <w:szCs w:val="24"/>
+          <w:rtl w:val="0"/>
+        </w:rPr>
+        <w:t xml:space="preserve">Звершення опрацювання теми: 16.10 </w:t>
+      </w:r>
+      <w:r>
+        <w:rPr>
+          <w:rtl w:val="0"/>
+        </w:rPr>
+      </w:r>
+    </w:p>
+    <w:p>
+      <w:pPr>
+        <w:numPr>
+          <w:ilvl w:val="0"/>
+          <w:numId w:val="3"/>
+        </w:numPr>
+        <w:spacing w:after="0" w:line="240" w:lineRule="auto"/>
+        <w:ind w:left="720" w:hanging="360"/>
+        <w:rPr>
+          <w:sz w:val="24"/>
+          <w:szCs w:val="24"/>
+        </w:rPr>
+      </w:pPr>
+      <w:r>
+        <w:rPr>
+          <w:rFonts w:ascii="Times New Roman" w:cs="Times New Roman" w:eastAsia="Times New Roman" w:hAnsi="Times New Roman"/>
+          <w:sz w:val="24"/>
+          <w:szCs w:val="24"/>
+          <w:rtl w:val="0"/>
+        </w:rPr>
+        <w:t xml:space="preserve">Тема №6: Функції C++</w:t>
+      </w:r>
+      <w:r>
+        <w:rPr>
+          <w:rtl w:val="0"/>
+        </w:rPr>
+      </w:r>
+    </w:p>
+    <w:p>
+      <w:pPr>
+        <w:numPr>
+          <w:ilvl w:val="1"/>
+          <w:numId w:val="3"/>
+        </w:numPr>
+        <w:spacing w:after="0" w:line="240" w:lineRule="auto"/>
+        <w:ind w:left="1440" w:hanging="360"/>
+        <w:rPr>
+          <w:sz w:val="24"/>
+          <w:szCs w:val="24"/>
+        </w:rPr>
+      </w:pPr>
+      <w:r>
+        <w:rPr>
+          <w:rFonts w:ascii="Times New Roman" w:cs="Times New Roman" w:eastAsia="Times New Roman" w:hAnsi="Times New Roman"/>
+          <w:sz w:val="24"/>
+          <w:szCs w:val="24"/>
+          <w:rtl w:val="0"/>
+        </w:rPr>
+        <w:t xml:space="preserve">Джерела Інформації:</w:t>
       </w:r>
       <w:r>
         <w:rPr>
@@ -2976,7 +3165,7 @@
           <w:szCs w:val="24"/>
           <w:rtl w:val="0"/>
         </w:rPr>
-        <w:t xml:space="preserve">Пошук, екстремуми, обхід, сортування, видалення та додавання елементів</w:t>
+        <w:t xml:space="preserve">Матеріали до Епіку 3</w:t>
       </w:r>
     </w:p>
     <w:p>
@@ -2991,7 +3180,6 @@
           <w:rFonts w:ascii="Times New Roman" w:cs="Times New Roman" w:eastAsia="Times New Roman" w:hAnsi="Times New Roman"/>
           <w:sz w:val="24"/>
           <w:szCs w:val="24"/>
-          <w:u w:val="none"/>
         </w:rPr>
       </w:pPr>
       <w:r>
@@ -3001,7 +3189,7 @@
           <w:szCs w:val="24"/>
           <w:rtl w:val="0"/>
         </w:rPr>
-        <w:t xml:space="preserve">Реалізація лінійного та двійкового пошуку</w:t>
+        <w:t xml:space="preserve">Лекційні матеріали</w:t>
       </w:r>
     </w:p>
     <w:p>
@@ -3019,262 +3207,7 @@
           <w:u w:val="none"/>
         </w:rPr>
       </w:pPr>
-      <w:r>
-        <w:rPr>
-          <w:rFonts w:ascii="Times New Roman" w:cs="Times New Roman" w:eastAsia="Times New Roman" w:hAnsi="Times New Roman"/>
-          <w:sz w:val="24"/>
-          <w:szCs w:val="24"/>
-          <w:rtl w:val="0"/>
-        </w:rPr>
-        <w:t xml:space="preserve">Базові алгоритми сортування: бульбашкове, вибором, вставками</w:t>
-      </w:r>
-    </w:p>
-    <w:p>
-      <w:pPr>
-        <w:numPr>
-          <w:ilvl w:val="2"/>
-          <w:numId w:val="3"/>
-        </w:numPr>
-        <w:spacing w:after="0" w:line="240" w:lineRule="auto"/>
-        <w:ind w:left="2160" w:hanging="360"/>
-        <w:rPr>
-          <w:rFonts w:ascii="Times New Roman" w:cs="Times New Roman" w:eastAsia="Times New Roman" w:hAnsi="Times New Roman"/>
-          <w:sz w:val="24"/>
-          <w:szCs w:val="24"/>
-          <w:u w:val="none"/>
-        </w:rPr>
-      </w:pPr>
-      <w:r>
-        <w:rPr>
-          <w:rFonts w:ascii="Times New Roman" w:cs="Times New Roman" w:eastAsia="Times New Roman" w:hAnsi="Times New Roman"/>
-          <w:sz w:val="24"/>
-          <w:szCs w:val="24"/>
-          <w:rtl w:val="0"/>
-        </w:rPr>
-        <w:t xml:space="preserve">Ефективні методи: </w:t>
-      </w:r>
-      <w:r>
-        <w:rPr>
-          <w:rFonts w:ascii="Times New Roman" w:cs="Times New Roman" w:eastAsia="Times New Roman" w:hAnsi="Times New Roman"/>
-          <w:sz w:val="24"/>
-          <w:szCs w:val="24"/>
-          <w:rtl w:val="0"/>
-        </w:rPr>
-        <w:t xml:space="preserve">MergeSort</w:t>
-      </w:r>
-      <w:r>
-        <w:rPr>
-          <w:rFonts w:ascii="Times New Roman" w:cs="Times New Roman" w:eastAsia="Times New Roman" w:hAnsi="Times New Roman"/>
-          <w:sz w:val="24"/>
-          <w:szCs w:val="24"/>
-          <w:rtl w:val="0"/>
-        </w:rPr>
-        <w:t xml:space="preserve">, QuickSort, сортування підрахунком</w:t>
-      </w:r>
-    </w:p>
-    <w:p>
-      <w:pPr>
-        <w:numPr>
-          <w:ilvl w:val="1"/>
-          <w:numId w:val="3"/>
-        </w:numPr>
-        <w:spacing w:after="0" w:line="240" w:lineRule="auto"/>
-        <w:ind w:left="1440" w:hanging="360"/>
-        <w:rPr>
-          <w:sz w:val="24"/>
-          <w:szCs w:val="24"/>
-        </w:rPr>
-      </w:pPr>
-      <w:r>
-        <w:rPr>
-          <w:rFonts w:ascii="Times New Roman" w:cs="Times New Roman" w:eastAsia="Times New Roman" w:hAnsi="Times New Roman"/>
-          <w:sz w:val="24"/>
-          <w:szCs w:val="24"/>
-          <w:rtl w:val="0"/>
-        </w:rPr>
-        <w:t xml:space="preserve">Статус: Ознайомлений</w:t>
-      </w:r>
-      <w:r>
-        <w:rPr>
-          <w:rtl w:val="0"/>
-        </w:rPr>
-      </w:r>
-    </w:p>
-    <w:p>
-      <w:pPr>
-        <w:numPr>
-          <w:ilvl w:val="1"/>
-          <w:numId w:val="3"/>
-        </w:numPr>
-        <w:spacing w:after="0" w:line="240" w:lineRule="auto"/>
-        <w:ind w:left="1440" w:hanging="360"/>
-        <w:rPr>
-          <w:sz w:val="24"/>
-          <w:szCs w:val="24"/>
-        </w:rPr>
-      </w:pPr>
-      <w:r>
-        <w:rPr>
-          <w:rFonts w:ascii="Times New Roman" w:cs="Times New Roman" w:eastAsia="Times New Roman" w:hAnsi="Times New Roman"/>
-          <w:sz w:val="24"/>
-          <w:szCs w:val="24"/>
-          <w:rtl w:val="0"/>
-        </w:rPr>
-        <w:t xml:space="preserve">Початок опрацювання теми: 02.10</w:t>
-      </w:r>
-      <w:r>
-        <w:rPr>
-          <w:rtl w:val="0"/>
-        </w:rPr>
-      </w:r>
-    </w:p>
-    <w:p>
-      <w:pPr>
-        <w:numPr>
-          <w:ilvl w:val="1"/>
-          <w:numId w:val="3"/>
-        </w:numPr>
-        <w:spacing w:after="0" w:line="240" w:lineRule="auto"/>
-        <w:ind w:left="1440" w:hanging="360"/>
-        <w:rPr>
-          <w:sz w:val="24"/>
-          <w:szCs w:val="24"/>
-        </w:rPr>
-      </w:pPr>
-      <w:r>
-        <w:rPr>
-          <w:rFonts w:ascii="Times New Roman" w:cs="Times New Roman" w:eastAsia="Times New Roman" w:hAnsi="Times New Roman"/>
-          <w:sz w:val="24"/>
-          <w:szCs w:val="24"/>
-          <w:rtl w:val="0"/>
-        </w:rPr>
-        <w:t xml:space="preserve">Звершення опрацювання теми: 16.10 </w:t>
-      </w:r>
-      <w:r>
-        <w:rPr>
-          <w:rtl w:val="0"/>
-        </w:rPr>
-      </w:r>
-    </w:p>
-    <w:p>
-      <w:pPr>
-        <w:numPr>
-          <w:ilvl w:val="0"/>
-          <w:numId w:val="3"/>
-        </w:numPr>
-        <w:spacing w:after="0" w:line="240" w:lineRule="auto"/>
-        <w:ind w:left="720" w:hanging="360"/>
-        <w:rPr>
-          <w:sz w:val="24"/>
-          <w:szCs w:val="24"/>
-        </w:rPr>
-      </w:pPr>
-      <w:r>
-        <w:rPr>
-          <w:rFonts w:ascii="Times New Roman" w:cs="Times New Roman" w:eastAsia="Times New Roman" w:hAnsi="Times New Roman"/>
-          <w:sz w:val="24"/>
-          <w:szCs w:val="24"/>
-          <w:rtl w:val="0"/>
-        </w:rPr>
-        <w:t xml:space="preserve">Тема №6: Функції C++</w:t>
-      </w:r>
-      <w:r>
-        <w:rPr>
-          <w:rtl w:val="0"/>
-        </w:rPr>
-      </w:r>
-    </w:p>
-    <w:p>
-      <w:pPr>
-        <w:numPr>
-          <w:ilvl w:val="1"/>
-          <w:numId w:val="3"/>
-        </w:numPr>
-        <w:spacing w:after="0" w:line="240" w:lineRule="auto"/>
-        <w:ind w:left="1440" w:hanging="360"/>
-        <w:rPr>
-          <w:sz w:val="24"/>
-          <w:szCs w:val="24"/>
-        </w:rPr>
-      </w:pPr>
-      <w:r>
-        <w:rPr>
-          <w:rFonts w:ascii="Times New Roman" w:cs="Times New Roman" w:eastAsia="Times New Roman" w:hAnsi="Times New Roman"/>
-          <w:sz w:val="24"/>
-          <w:szCs w:val="24"/>
-          <w:rtl w:val="0"/>
-        </w:rPr>
-        <w:t xml:space="preserve">Джерела Інформації:</w:t>
-      </w:r>
-      <w:r>
-        <w:rPr>
-          <w:rtl w:val="0"/>
-        </w:rPr>
-      </w:r>
-    </w:p>
-    <w:p>
-      <w:pPr>
-        <w:numPr>
-          <w:ilvl w:val="2"/>
-          <w:numId w:val="3"/>
-        </w:numPr>
-        <w:spacing w:after="0" w:line="240" w:lineRule="auto"/>
-        <w:ind w:left="2160" w:hanging="360"/>
-        <w:rPr>
-          <w:sz w:val="24"/>
-          <w:szCs w:val="24"/>
-        </w:rPr>
-      </w:pPr>
-      <w:r>
-        <w:rPr>
-          <w:rFonts w:ascii="Times New Roman" w:cs="Times New Roman" w:eastAsia="Times New Roman" w:hAnsi="Times New Roman"/>
-          <w:sz w:val="24"/>
-          <w:szCs w:val="24"/>
-          <w:rtl w:val="0"/>
-        </w:rPr>
-        <w:t xml:space="preserve">Матеріали до Епіку 3</w:t>
-      </w:r>
-    </w:p>
-    <w:p>
-      <w:pPr>
-        <w:numPr>
-          <w:ilvl w:val="2"/>
-          <w:numId w:val="3"/>
-        </w:numPr>
-        <w:spacing w:after="0" w:line="240" w:lineRule="auto"/>
-        <w:ind w:left="2160" w:hanging="360"/>
-        <w:rPr>
-          <w:rFonts w:ascii="Times New Roman" w:cs="Times New Roman" w:eastAsia="Times New Roman" w:hAnsi="Times New Roman"/>
-          <w:sz w:val="24"/>
-          <w:szCs w:val="24"/>
-        </w:rPr>
-      </w:pPr>
-      <w:r>
-        <w:rPr>
-          <w:rFonts w:ascii="Times New Roman" w:cs="Times New Roman" w:eastAsia="Times New Roman" w:hAnsi="Times New Roman"/>
-          <w:sz w:val="24"/>
-          <w:szCs w:val="24"/>
-          <w:rtl w:val="0"/>
-        </w:rPr>
-        <w:t xml:space="preserve">Лекційні матеріали</w:t>
-      </w:r>
-    </w:p>
-    <w:p>
-      <w:pPr>
-        <w:numPr>
-          <w:ilvl w:val="2"/>
-          <w:numId w:val="3"/>
-        </w:numPr>
-        <w:spacing w:after="0" w:line="240" w:lineRule="auto"/>
-        <w:ind w:left="2160" w:hanging="360"/>
-        <w:rPr>
-          <w:rFonts w:ascii="Times New Roman" w:cs="Times New Roman" w:eastAsia="Times New Roman" w:hAnsi="Times New Roman"/>
-          <w:sz w:val="24"/>
-          <w:szCs w:val="24"/>
-          <w:u w:val="none"/>
-        </w:rPr>
-      </w:pPr>
-      <w:hyperlink r:id="rId15">
+      <w:hyperlink r:id="rId13">
         <w:r>
           <w:rPr>
             <w:rFonts w:ascii="Times New Roman" w:cs="Times New Roman" w:eastAsia="Times New Roman" w:hAnsi="Times New Roman"/>
@@ -3660,7 +3593,7 @@
           <wp:inline distB="114300" distT="114300" distL="114300" distR="114300">
             <wp:extent cx="1428750" cy="762000"/>
             <wp:effectExtent b="12700" l="12700" r="12700" t="12700"/>
-            <wp:docPr id="13" name="image12.png"/>
+            <wp:docPr id="12" name="image12.png"/>
             <a:graphic>
               <a:graphicData uri="http://schemas.openxmlformats.org/drawingml/2006/picture">
                 <pic:pic>
@@ -3669,7 +3602,7 @@
                     <pic:cNvPicPr preferRelativeResize="0"/>
                   </pic:nvPicPr>
                   <pic:blipFill>
-                    <a:blip r:embed="rId16"/>
+                    <a:blip r:embed="rId14"/>
                     <a:srcRect b="0" l="0" r="0" t="0"/>
                     <a:stretch>
                       <a:fillRect/>
@@ -3792,16 +3725,16 @@
           <wp:inline distB="114300" distT="114300" distL="114300" distR="114300">
             <wp:extent cx="6210960" cy="1524000"/>
             <wp:effectExtent b="12700" l="12700" r="12700" t="12700"/>
-            <wp:docPr id="27" name="image23.png"/>
+            <wp:docPr id="26" name="image26.png"/>
             <a:graphic>
               <a:graphicData uri="http://schemas.openxmlformats.org/drawingml/2006/picture">
                 <pic:pic>
                   <pic:nvPicPr>
-                    <pic:cNvPr id="0" name="image23.png"/>
+                    <pic:cNvPr id="0" name="image26.png"/>
                     <pic:cNvPicPr preferRelativeResize="0"/>
                   </pic:nvPicPr>
                   <pic:blipFill>
-                    <a:blip r:embed="rId17"/>
+                    <a:blip r:embed="rId15"/>
                     <a:srcRect b="0" l="0" r="0" t="0"/>
                     <a:stretch>
                       <a:fillRect/>
@@ -3852,16 +3785,16 @@
           <wp:inline distB="114300" distT="114300" distL="114300" distR="114300">
             <wp:extent cx="6210960" cy="469900"/>
             <wp:effectExtent b="12700" l="12700" r="12700" t="12700"/>
-            <wp:docPr id="7" name="image14.png"/>
+            <wp:docPr id="7" name="image7.png"/>
             <a:graphic>
               <a:graphicData uri="http://schemas.openxmlformats.org/drawingml/2006/picture">
                 <pic:pic>
                   <pic:nvPicPr>
-                    <pic:cNvPr id="0" name="image14.png"/>
+                    <pic:cNvPr id="0" name="image7.png"/>
                     <pic:cNvPicPr preferRelativeResize="0"/>
                   </pic:nvPicPr>
                   <pic:blipFill>
-                    <a:blip r:embed="rId18"/>
+                    <a:blip r:embed="rId16"/>
                     <a:srcRect b="0" l="0" r="0" t="0"/>
                     <a:stretch>
                       <a:fillRect/>
@@ -5262,7 +5195,7 @@
         <w:br w:type="textWrapping"/>
         <w:t xml:space="preserve">Вирішити задачу з Algotester: </w:t>
       </w:r>
-      <w:hyperlink r:id="rId19">
+      <w:hyperlink r:id="rId17">
         <w:r>
           <w:rPr>
             <w:rFonts w:ascii="Times New Roman" w:cs="Times New Roman" w:eastAsia="Times New Roman" w:hAnsi="Times New Roman"/>
@@ -5338,7 +5271,7 @@
         <w:br w:type="textWrapping"/>
         <w:t xml:space="preserve">Вирішити задачу з Algotester: </w:t>
       </w:r>
-      <w:hyperlink r:id="rId20">
+      <w:hyperlink r:id="rId18">
         <w:r>
           <w:rPr>
             <w:rFonts w:ascii="Times New Roman" w:cs="Times New Roman" w:eastAsia="Times New Roman" w:hAnsi="Times New Roman"/>
@@ -5414,7 +5347,7 @@
         <w:br w:type="textWrapping"/>
         <w:t xml:space="preserve">Вирішити задачу з Algotester: </w:t>
       </w:r>
-      <w:hyperlink r:id="rId21">
+      <w:hyperlink r:id="rId19">
         <w:r>
           <w:rPr>
             <w:rFonts w:ascii="Times New Roman" w:cs="Times New Roman" w:eastAsia="Times New Roman" w:hAnsi="Times New Roman"/>
@@ -5683,16 +5616,16 @@
           <wp:inline distB="114300" distT="114300" distL="114300" distR="114300">
             <wp:extent cx="4714875" cy="7153275"/>
             <wp:effectExtent b="0" l="0" r="0" t="0"/>
-            <wp:docPr id="3" name="image4.png"/>
+            <wp:docPr id="3" name="image3.png"/>
             <a:graphic>
               <a:graphicData uri="http://schemas.openxmlformats.org/drawingml/2006/picture">
                 <pic:pic>
                   <pic:nvPicPr>
-                    <pic:cNvPr id="0" name="image4.png"/>
+                    <pic:cNvPr id="0" name="image3.png"/>
                     <pic:cNvPicPr preferRelativeResize="0"/>
                   </pic:nvPicPr>
                   <pic:blipFill>
-                    <a:blip r:embed="rId22"/>
+                    <a:blip r:embed="rId20"/>
                     <a:srcRect b="0" l="0" r="0" t="0"/>
                     <a:stretch>
                       <a:fillRect/>
@@ -5751,16 +5684,16 @@
           <wp:inline distB="114300" distT="114300" distL="114300" distR="114300">
             <wp:extent cx="1952625" cy="2714625"/>
             <wp:effectExtent b="0" l="0" r="0" t="0"/>
-            <wp:docPr id="8" name="image6.png"/>
+            <wp:docPr id="8" name="image8.png"/>
             <a:graphic>
               <a:graphicData uri="http://schemas.openxmlformats.org/drawingml/2006/picture">
                 <pic:pic>
                   <pic:nvPicPr>
-                    <pic:cNvPr id="0" name="image6.png"/>
+                    <pic:cNvPr id="0" name="image8.png"/>
                     <pic:cNvPicPr preferRelativeResize="0"/>
                   </pic:nvPicPr>
                   <pic:blipFill>
-                    <a:blip r:embed="rId23"/>
+                    <a:blip r:embed="rId21"/>
                     <a:srcRect b="0" l="0" r="0" t="0"/>
                     <a:stretch>
                       <a:fillRect/>
@@ -5788,48 +5721,9 @@
         </w:rPr>
         <w:drawing>
           <wp:inline distB="114300" distT="114300" distL="114300" distR="114300">
-            <wp:extent cx="2686050" cy="2209800"/>
-            <wp:effectExtent b="0" l="0" r="0" t="0"/>
-            <wp:docPr id="10" name="image5.png"/>
-            <a:graphic>
-              <a:graphicData uri="http://schemas.openxmlformats.org/drawingml/2006/picture">
-                <pic:pic>
-                  <pic:nvPicPr>
-                    <pic:cNvPr id="0" name="image5.png"/>
-                    <pic:cNvPicPr preferRelativeResize="0"/>
-                  </pic:nvPicPr>
-                  <pic:blipFill>
-                    <a:blip r:embed="rId24"/>
-                    <a:srcRect b="0" l="0" r="0" t="0"/>
-                    <a:stretch>
-                      <a:fillRect/>
-                    </a:stretch>
-                  </pic:blipFill>
-                  <pic:spPr>
-                    <a:xfrm>
-                      <a:off x="0" y="0"/>
-                      <a:ext cx="2686050" cy="2209800"/>
-                    </a:xfrm>
-                    <a:prstGeom prst="rect"/>
-                    <a:ln/>
-                  </pic:spPr>
-                </pic:pic>
-              </a:graphicData>
-            </a:graphic>
-          </wp:inline>
-        </w:drawing>
-      </w:r>
-      <w:r>
-        <w:rPr>
-          <w:rFonts w:ascii="Times New Roman" w:cs="Times New Roman" w:eastAsia="Times New Roman" w:hAnsi="Times New Roman"/>
-          <w:sz w:val="24"/>
-          <w:szCs w:val="24"/>
-        </w:rPr>
-        <w:drawing>
-          <wp:inline distB="114300" distT="114300" distL="114300" distR="114300">
             <wp:extent cx="4210050" cy="4305300"/>
             <wp:effectExtent b="0" l="0" r="0" t="0"/>
-            <wp:docPr id="21" name="image20.png"/>
+            <wp:docPr id="20" name="image20.png"/>
             <a:graphic>
               <a:graphicData uri="http://schemas.openxmlformats.org/drawingml/2006/picture">
                 <pic:pic>
@@ -5838,7 +5732,7 @@
                     <pic:cNvPicPr preferRelativeResize="0"/>
                   </pic:nvPicPr>
                   <pic:blipFill>
-                    <a:blip r:embed="rId25"/>
+                    <a:blip r:embed="rId22"/>
                     <a:srcRect b="0" l="0" r="0" t="0"/>
                     <a:stretch>
                       <a:fillRect/>
@@ -5868,16 +5762,16 @@
           <wp:inline distB="114300" distT="114300" distL="114300" distR="114300">
             <wp:extent cx="3257550" cy="3638550"/>
             <wp:effectExtent b="0" l="0" r="0" t="0"/>
-            <wp:docPr id="17" name="image8.png"/>
+            <wp:docPr id="16" name="image17.png"/>
             <a:graphic>
               <a:graphicData uri="http://schemas.openxmlformats.org/drawingml/2006/picture">
                 <pic:pic>
                   <pic:nvPicPr>
-                    <pic:cNvPr id="0" name="image8.png"/>
+                    <pic:cNvPr id="0" name="image17.png"/>
                     <pic:cNvPicPr preferRelativeResize="0"/>
                   </pic:nvPicPr>
                   <pic:blipFill>
-                    <a:blip r:embed="rId26"/>
+                    <a:blip r:embed="rId23"/>
                     <a:srcRect b="0" l="0" r="0" t="0"/>
                     <a:stretch>
                       <a:fillRect/>
@@ -5907,16 +5801,16 @@
           <wp:inline distB="114300" distT="114300" distL="114300" distR="114300">
             <wp:extent cx="3571875" cy="4619625"/>
             <wp:effectExtent b="0" l="0" r="0" t="0"/>
-            <wp:docPr id="25" name="image22.png"/>
+            <wp:docPr id="24" name="image24.png"/>
             <a:graphic>
               <a:graphicData uri="http://schemas.openxmlformats.org/drawingml/2006/picture">
                 <pic:pic>
                   <pic:nvPicPr>
-                    <pic:cNvPr id="0" name="image22.png"/>
+                    <pic:cNvPr id="0" name="image24.png"/>
                     <pic:cNvPicPr preferRelativeResize="0"/>
                   </pic:nvPicPr>
                   <pic:blipFill>
-                    <a:blip r:embed="rId27"/>
+                    <a:blip r:embed="rId24"/>
                     <a:srcRect b="0" l="0" r="0" t="0"/>
                     <a:stretch>
                       <a:fillRect/>
@@ -5946,16 +5840,16 @@
           <wp:inline distB="114300" distT="114300" distL="114300" distR="114300">
             <wp:extent cx="2876550" cy="4067175"/>
             <wp:effectExtent b="0" l="0" r="0" t="0"/>
-            <wp:docPr id="15" name="image15.png"/>
+            <wp:docPr id="14" name="image14.png"/>
             <a:graphic>
               <a:graphicData uri="http://schemas.openxmlformats.org/drawingml/2006/picture">
                 <pic:pic>
                   <pic:nvPicPr>
-                    <pic:cNvPr id="0" name="image15.png"/>
+                    <pic:cNvPr id="0" name="image14.png"/>
                     <pic:cNvPicPr preferRelativeResize="0"/>
                   </pic:nvPicPr>
                   <pic:blipFill>
-                    <a:blip r:embed="rId28"/>
+                    <a:blip r:embed="rId25"/>
                     <a:srcRect b="0" l="0" r="0" t="0"/>
                     <a:stretch>
                       <a:fillRect/>
@@ -5985,16 +5879,16 @@
           <wp:inline distB="114300" distT="114300" distL="114300" distR="114300">
             <wp:extent cx="2314575" cy="3257550"/>
             <wp:effectExtent b="0" l="0" r="0" t="0"/>
-            <wp:docPr id="9" name="image7.png"/>
+            <wp:docPr id="9" name="image9.png"/>
             <a:graphic>
               <a:graphicData uri="http://schemas.openxmlformats.org/drawingml/2006/picture">
                 <pic:pic>
                   <pic:nvPicPr>
-                    <pic:cNvPr id="0" name="image7.png"/>
+                    <pic:cNvPr id="0" name="image9.png"/>
                     <pic:cNvPicPr preferRelativeResize="0"/>
                   </pic:nvPicPr>
                   <pic:blipFill>
-                    <a:blip r:embed="rId29"/>
+                    <a:blip r:embed="rId26"/>
                     <a:srcRect b="0" l="0" r="0" t="0"/>
                     <a:stretch>
                       <a:fillRect/>
@@ -6024,16 +5918,16 @@
           <wp:inline distB="114300" distT="114300" distL="114300" distR="114300">
             <wp:extent cx="3238500" cy="5591175"/>
             <wp:effectExtent b="0" l="0" r="0" t="0"/>
-            <wp:docPr id="5" name="image3.png"/>
+            <wp:docPr id="5" name="image5.png"/>
             <a:graphic>
               <a:graphicData uri="http://schemas.openxmlformats.org/drawingml/2006/picture">
                 <pic:pic>
                   <pic:nvPicPr>
-                    <pic:cNvPr id="0" name="image3.png"/>
+                    <pic:cNvPr id="0" name="image5.png"/>
                     <pic:cNvPicPr preferRelativeResize="0"/>
                   </pic:nvPicPr>
                   <pic:blipFill>
-                    <a:blip r:embed="rId30"/>
+                    <a:blip r:embed="rId27"/>
                     <a:srcRect b="0" l="0" r="0" t="0"/>
                     <a:stretch>
                       <a:fillRect/>
@@ -6063,16 +5957,16 @@
           <wp:inline distB="114300" distT="114300" distL="114300" distR="114300">
             <wp:extent cx="3714750" cy="5305425"/>
             <wp:effectExtent b="0" l="0" r="0" t="0"/>
-            <wp:docPr id="23" name="image18.png"/>
+            <wp:docPr id="22" name="image22.png"/>
             <a:graphic>
               <a:graphicData uri="http://schemas.openxmlformats.org/drawingml/2006/picture">
                 <pic:pic>
                   <pic:nvPicPr>
-                    <pic:cNvPr id="0" name="image18.png"/>
+                    <pic:cNvPr id="0" name="image22.png"/>
                     <pic:cNvPicPr preferRelativeResize="0"/>
                   </pic:nvPicPr>
                   <pic:blipFill>
-                    <a:blip r:embed="rId31"/>
+                    <a:blip r:embed="rId28"/>
                     <a:srcRect b="0" l="0" r="0" t="0"/>
                     <a:stretch>
                       <a:fillRect/>
@@ -6102,16 +5996,16 @@
           <wp:inline distB="114300" distT="114300" distL="114300" distR="114300">
             <wp:extent cx="3905250" cy="6734175"/>
             <wp:effectExtent b="0" l="0" r="0" t="0"/>
-            <wp:docPr id="22" name="image25.png"/>
+            <wp:docPr id="21" name="image21.png"/>
             <a:graphic>
               <a:graphicData uri="http://schemas.openxmlformats.org/drawingml/2006/picture">
                 <pic:pic>
                   <pic:nvPicPr>
-                    <pic:cNvPr id="0" name="image25.png"/>
+                    <pic:cNvPr id="0" name="image21.png"/>
                     <pic:cNvPicPr preferRelativeResize="0"/>
                   </pic:nvPicPr>
                   <pic:blipFill>
-                    <a:blip r:embed="rId32"/>
+                    <a:blip r:embed="rId29"/>
                     <a:srcRect b="0" l="0" r="0" t="0"/>
                     <a:stretch>
                       <a:fillRect/>
@@ -6141,16 +6035,16 @@
           <wp:inline distB="114300" distT="114300" distL="114300" distR="114300">
             <wp:extent cx="6210960" cy="5753100"/>
             <wp:effectExtent b="0" l="0" r="0" t="0"/>
-            <wp:docPr id="18" name="image2.png"/>
+            <wp:docPr id="17" name="image16.png"/>
             <a:graphic>
               <a:graphicData uri="http://schemas.openxmlformats.org/drawingml/2006/picture">
                 <pic:pic>
                   <pic:nvPicPr>
-                    <pic:cNvPr id="0" name="image2.png"/>
+                    <pic:cNvPr id="0" name="image16.png"/>
                     <pic:cNvPicPr preferRelativeResize="0"/>
                   </pic:nvPicPr>
                   <pic:blipFill>
-                    <a:blip r:embed="rId33"/>
+                    <a:blip r:embed="rId30"/>
                     <a:srcRect b="0" l="0" r="0" t="0"/>
                     <a:stretch>
                       <a:fillRect/>
@@ -6180,16 +6074,16 @@
           <wp:inline distB="114300" distT="114300" distL="114300" distR="114300">
             <wp:extent cx="4000500" cy="7543800"/>
             <wp:effectExtent b="0" l="0" r="0" t="0"/>
-            <wp:docPr id="24" name="image26.png"/>
+            <wp:docPr id="23" name="image23.png"/>
             <a:graphic>
               <a:graphicData uri="http://schemas.openxmlformats.org/drawingml/2006/picture">
                 <pic:pic>
                   <pic:nvPicPr>
-                    <pic:cNvPr id="0" name="image26.png"/>
+                    <pic:cNvPr id="0" name="image23.png"/>
                     <pic:cNvPicPr preferRelativeResize="0"/>
                   </pic:nvPicPr>
                   <pic:blipFill>
-                    <a:blip r:embed="rId34"/>
+                    <a:blip r:embed="rId31"/>
                     <a:srcRect b="0" l="0" r="0" t="0"/>
                     <a:stretch>
                       <a:fillRect/>
@@ -6219,16 +6113,16 @@
           <wp:inline distB="114300" distT="114300" distL="114300" distR="114300">
             <wp:extent cx="5905500" cy="7429500"/>
             <wp:effectExtent b="0" l="0" r="0" t="0"/>
-            <wp:docPr id="14" name="image21.png"/>
+            <wp:docPr id="13" name="image13.png"/>
             <a:graphic>
               <a:graphicData uri="http://schemas.openxmlformats.org/drawingml/2006/picture">
                 <pic:pic>
                   <pic:nvPicPr>
-                    <pic:cNvPr id="0" name="image21.png"/>
+                    <pic:cNvPr id="0" name="image13.png"/>
                     <pic:cNvPicPr preferRelativeResize="0"/>
                   </pic:nvPicPr>
                   <pic:blipFill>
-                    <a:blip r:embed="rId35"/>
+                    <a:blip r:embed="rId32"/>
                     <a:srcRect b="0" l="0" r="0" t="0"/>
                     <a:stretch>
                       <a:fillRect/>
@@ -6287,16 +6181,16 @@
           <wp:inline distB="114300" distT="114300" distL="114300" distR="114300">
             <wp:extent cx="3819525" cy="7210425"/>
             <wp:effectExtent b="0" l="0" r="0" t="0"/>
-            <wp:docPr id="2" name="image19.png"/>
+            <wp:docPr id="2" name="image2.png"/>
             <a:graphic>
               <a:graphicData uri="http://schemas.openxmlformats.org/drawingml/2006/picture">
                 <pic:pic>
                   <pic:nvPicPr>
-                    <pic:cNvPr id="0" name="image19.png"/>
+                    <pic:cNvPr id="0" name="image2.png"/>
                     <pic:cNvPicPr preferRelativeResize="0"/>
                   </pic:nvPicPr>
                   <pic:blipFill>
-                    <a:blip r:embed="rId36"/>
+                    <a:blip r:embed="rId33"/>
                     <a:srcRect b="0" l="0" r="0" t="0"/>
                     <a:stretch>
                       <a:fillRect/>
@@ -6326,16 +6220,16 @@
           <wp:inline distB="114300" distT="114300" distL="114300" distR="114300">
             <wp:extent cx="6210960" cy="3822700"/>
             <wp:effectExtent b="0" l="0" r="0" t="0"/>
-            <wp:docPr id="12" name="image17.png"/>
+            <wp:docPr id="11" name="image11.png"/>
             <a:graphic>
               <a:graphicData uri="http://schemas.openxmlformats.org/drawingml/2006/picture">
                 <pic:pic>
                   <pic:nvPicPr>
-                    <pic:cNvPr id="0" name="image17.png"/>
+                    <pic:cNvPr id="0" name="image11.png"/>
                     <pic:cNvPicPr preferRelativeResize="0"/>
                   </pic:nvPicPr>
                   <pic:blipFill>
-                    <a:blip r:embed="rId37"/>
+                    <a:blip r:embed="rId34"/>
                     <a:srcRect b="0" l="0" r="0" t="0"/>
                     <a:stretch>
                       <a:fillRect/>
@@ -6394,16 +6288,16 @@
           <wp:inline distB="114300" distT="114300" distL="114300" distR="114300">
             <wp:extent cx="6210960" cy="4495800"/>
             <wp:effectExtent b="0" l="0" r="0" t="0"/>
-            <wp:docPr id="6" name="image27.png"/>
+            <wp:docPr id="6" name="image6.png"/>
             <a:graphic>
               <a:graphicData uri="http://schemas.openxmlformats.org/drawingml/2006/picture">
                 <pic:pic>
                   <pic:nvPicPr>
-                    <pic:cNvPr id="0" name="image27.png"/>
+                    <pic:cNvPr id="0" name="image6.png"/>
                     <pic:cNvPicPr preferRelativeResize="0"/>
                   </pic:nvPicPr>
                   <pic:blipFill>
-                    <a:blip r:embed="rId38"/>
+                    <a:blip r:embed="rId35"/>
                     <a:srcRect b="0" l="0" r="0" t="0"/>
                     <a:stretch>
                       <a:fillRect/>
@@ -6582,16 +6476,16 @@
           <wp:inline distB="114300" distT="114300" distL="114300" distR="114300">
             <wp:extent cx="6210960" cy="5156200"/>
             <wp:effectExtent b="0" l="0" r="0" t="0"/>
-            <wp:docPr id="20" name="image24.png"/>
+            <wp:docPr id="19" name="image19.png"/>
             <a:graphic>
               <a:graphicData uri="http://schemas.openxmlformats.org/drawingml/2006/picture">
                 <pic:pic>
                   <pic:nvPicPr>
-                    <pic:cNvPr id="0" name="image24.png"/>
+                    <pic:cNvPr id="0" name="image19.png"/>
                     <pic:cNvPicPr preferRelativeResize="0"/>
                   </pic:nvPicPr>
                   <pic:blipFill>
-                    <a:blip r:embed="rId39"/>
+                    <a:blip r:embed="rId36"/>
                     <a:srcRect b="0" l="0" r="0" t="0"/>
                     <a:stretch>
                       <a:fillRect/>
@@ -29486,7 +29380,7 @@
         </w:rPr>
         <w:t xml:space="preserve">PR:</w:t>
       </w:r>
-      <w:hyperlink r:id="rId40">
+      <w:hyperlink r:id="rId37">
         <w:r>
           <w:rPr>
             <w:rFonts w:ascii="Times New Roman" w:cs="Times New Roman" w:eastAsia="Times New Roman" w:hAnsi="Times New Roman"/>
@@ -33157,7 +33051,7 @@
         </w:rPr>
         <w:t xml:space="preserve">PR:</w:t>
       </w:r>
-      <w:hyperlink r:id="rId41">
+      <w:hyperlink r:id="rId38">
         <w:r>
           <w:rPr>
             <w:rFonts w:ascii="Times New Roman" w:cs="Times New Roman" w:eastAsia="Times New Roman" w:hAnsi="Times New Roman"/>
@@ -35892,7 +35786,7 @@
         </w:rPr>
         <w:t xml:space="preserve">PR:</w:t>
       </w:r>
-      <w:hyperlink r:id="rId42">
+      <w:hyperlink r:id="rId39">
         <w:r>
           <w:rPr>
             <w:rFonts w:ascii="Times New Roman" w:cs="Times New Roman" w:eastAsia="Times New Roman" w:hAnsi="Times New Roman"/>
@@ -39760,7 +39654,7 @@
         </w:rPr>
         <w:t xml:space="preserve">PR:</w:t>
       </w:r>
-      <w:hyperlink r:id="rId43">
+      <w:hyperlink r:id="rId40">
         <w:r>
           <w:rPr>
             <w:rFonts w:ascii="Times New Roman" w:cs="Times New Roman" w:eastAsia="Times New Roman" w:hAnsi="Times New Roman"/>
@@ -42039,7 +41933,7 @@
         </w:rPr>
         <w:t xml:space="preserve">PR:</w:t>
       </w:r>
-      <w:hyperlink r:id="rId44">
+      <w:hyperlink r:id="rId41">
         <w:r>
           <w:rPr>
             <w:rFonts w:ascii="Times New Roman" w:cs="Times New Roman" w:eastAsia="Times New Roman" w:hAnsi="Times New Roman"/>
@@ -42196,16 +42090,16 @@
           <wp:inline distB="114300" distT="114300" distL="114300" distR="114300">
             <wp:extent cx="3882847" cy="3504248"/>
             <wp:effectExtent b="0" l="0" r="0" t="0"/>
-            <wp:docPr id="1" name="image10.png"/>
+            <wp:docPr id="1" name="image1.png"/>
             <a:graphic>
               <a:graphicData uri="http://schemas.openxmlformats.org/drawingml/2006/picture">
                 <pic:pic>
                   <pic:nvPicPr>
-                    <pic:cNvPr id="0" name="image10.png"/>
+                    <pic:cNvPr id="0" name="image1.png"/>
                     <pic:cNvPicPr preferRelativeResize="0"/>
                   </pic:nvPicPr>
                   <pic:blipFill>
-                    <a:blip r:embed="rId45"/>
+                    <a:blip r:embed="rId42"/>
                     <a:srcRect b="0" l="0" r="0" t="0"/>
                     <a:stretch>
                       <a:fillRect/>
@@ -42275,16 +42169,16 @@
           <wp:inline distB="114300" distT="114300" distL="114300" distR="114300">
             <wp:extent cx="4619625" cy="7115175"/>
             <wp:effectExtent b="0" l="0" r="0" t="0"/>
-            <wp:docPr id="4" name="image16.png"/>
+            <wp:docPr id="4" name="image4.png"/>
             <a:graphic>
               <a:graphicData uri="http://schemas.openxmlformats.org/drawingml/2006/picture">
                 <pic:pic>
                   <pic:nvPicPr>
-                    <pic:cNvPr id="0" name="image16.png"/>
+                    <pic:cNvPr id="0" name="image4.png"/>
                     <pic:cNvPicPr preferRelativeResize="0"/>
                   </pic:nvPicPr>
                   <pic:blipFill>
-                    <a:blip r:embed="rId46"/>
+                    <a:blip r:embed="rId43"/>
                     <a:srcRect b="0" l="0" r="0" t="0"/>
                     <a:stretch>
                       <a:fillRect/>
@@ -42421,16 +42315,16 @@
           <wp:inline distB="114300" distT="114300" distL="114300" distR="114300">
             <wp:extent cx="6210960" cy="647700"/>
             <wp:effectExtent b="0" l="0" r="0" t="0"/>
-            <wp:docPr id="11" name="image9.png"/>
+            <wp:docPr id="10" name="image10.png"/>
             <a:graphic>
               <a:graphicData uri="http://schemas.openxmlformats.org/drawingml/2006/picture">
                 <pic:pic>
                   <pic:nvPicPr>
-                    <pic:cNvPr id="0" name="image9.png"/>
+                    <pic:cNvPr id="0" name="image10.png"/>
                     <pic:cNvPicPr preferRelativeResize="0"/>
                   </pic:nvPicPr>
                   <pic:blipFill>
-                    <a:blip r:embed="rId47"/>
+                    <a:blip r:embed="rId44"/>
                     <a:srcRect b="0" l="0" r="0" t="0"/>
                     <a:stretch>
                       <a:fillRect/>
@@ -42604,16 +42498,16 @@
           <wp:inline distB="114300" distT="114300" distL="114300" distR="114300">
             <wp:extent cx="4410075" cy="2781300"/>
             <wp:effectExtent b="0" l="0" r="0" t="0"/>
-            <wp:docPr id="16" name="image1.png"/>
+            <wp:docPr id="15" name="image15.png"/>
             <a:graphic>
               <a:graphicData uri="http://schemas.openxmlformats.org/drawingml/2006/picture">
                 <pic:pic>
                   <pic:nvPicPr>
-                    <pic:cNvPr id="0" name="image1.png"/>
+                    <pic:cNvPr id="0" name="image15.png"/>
                     <pic:cNvPicPr preferRelativeResize="0"/>
                   </pic:nvPicPr>
                   <pic:blipFill>
-                    <a:blip r:embed="rId48"/>
+                    <a:blip r:embed="rId45"/>
                     <a:srcRect b="0" l="0" r="0" t="0"/>
                     <a:stretch>
                       <a:fillRect/>
@@ -42994,16 +42888,16 @@
           <wp:inline distB="114300" distT="114300" distL="114300" distR="114300">
             <wp:extent cx="6210960" cy="2908300"/>
             <wp:effectExtent b="0" l="0" r="0" t="0"/>
-            <wp:docPr id="19" name="image11.png"/>
+            <wp:docPr id="18" name="image18.png"/>
             <a:graphic>
               <a:graphicData uri="http://schemas.openxmlformats.org/drawingml/2006/picture">
                 <pic:pic>
                   <pic:nvPicPr>
-                    <pic:cNvPr id="0" name="image11.png"/>
+                    <pic:cNvPr id="0" name="image18.png"/>
                     <pic:cNvPicPr preferRelativeResize="0"/>
                   </pic:nvPicPr>
                   <pic:blipFill>
-                    <a:blip r:embed="rId49"/>
+                    <a:blip r:embed="rId46"/>
                     <a:srcRect b="0" l="0" r="0" t="0"/>
                     <a:stretch>
                       <a:fillRect/>
@@ -43336,9 +43230,9 @@
       </w:r>
     </w:p>
     <w:sectPr>
-      <w:headerReference r:id="rId50" w:type="first"/>
-      <w:footerReference r:id="rId51" w:type="default"/>
-      <w:footerReference r:id="rId52" w:type="first"/>
+      <w:headerReference r:id="rId47" w:type="first"/>
+      <w:footerReference r:id="rId48" w:type="default"/>
+      <w:footerReference r:id="rId49" w:type="first"/>
       <w:pgSz w:h="16838" w:w="11906" w:orient="portrait"/>
       <w:pgMar w:bottom="1134" w:top="1134" w:left="1134" w:right="990.4724409448835" w:header="708" w:footer="708"/>
       <w:pgNumType w:start="1"/>

</xml_diff>

<commit_message>
fix: replace broken flowcharts with new versions
</commit_message>
<xml_diff>
--- a/ai_11/sviatoslav_davydovych/epic_3/epic_3_report_sviatoslav_davydovych.docx
+++ b/ai_11/sviatoslav_davydovych/epic_3/epic_3_report_sviatoslav_davydovych.docx
@@ -104,12 +104,12 @@
             <wp:extent cx="2710845" cy="2571750"/>
             <wp:effectExtent b="0" l="0" r="0" t="0"/>
             <wp:wrapNone/>
-            <wp:docPr descr="A blue and white logo&#10;&#10;Description automatically generated" id="27" name="image28.jpg"/>
+            <wp:docPr descr="A blue and white logo&#10;&#10;Description automatically generated" id="28" name="image23.jpg"/>
             <a:graphic>
               <a:graphicData uri="http://schemas.openxmlformats.org/drawingml/2006/picture">
                 <pic:pic>
                   <pic:nvPicPr>
-                    <pic:cNvPr descr="A blue and white logo&#10;&#10;Description automatically generated" id="0" name="image28.jpg"/>
+                    <pic:cNvPr descr="A blue and white logo&#10;&#10;Description automatically generated" id="0" name="image23.jpg"/>
                     <pic:cNvPicPr preferRelativeResize="0"/>
                   </pic:nvPicPr>
                   <pic:blipFill>
@@ -3593,12 +3593,12 @@
           <wp:inline distB="114300" distT="114300" distL="114300" distR="114300">
             <wp:extent cx="1428750" cy="762000"/>
             <wp:effectExtent b="12700" l="12700" r="12700" t="12700"/>
-            <wp:docPr id="20" name="image22.png"/>
+            <wp:docPr id="14" name="image12.png"/>
             <a:graphic>
               <a:graphicData uri="http://schemas.openxmlformats.org/drawingml/2006/picture">
                 <pic:pic>
                   <pic:nvPicPr>
-                    <pic:cNvPr id="0" name="image22.png"/>
+                    <pic:cNvPr id="0" name="image12.png"/>
                     <pic:cNvPicPr preferRelativeResize="0"/>
                   </pic:nvPicPr>
                   <pic:blipFill>
@@ -3725,12 +3725,12 @@
           <wp:inline distB="114300" distT="114300" distL="114300" distR="114300">
             <wp:extent cx="6210960" cy="1524000"/>
             <wp:effectExtent b="12700" l="12700" r="12700" t="12700"/>
-            <wp:docPr id="28" name="image18.png"/>
+            <wp:docPr id="29" name="image28.png"/>
             <a:graphic>
               <a:graphicData uri="http://schemas.openxmlformats.org/drawingml/2006/picture">
                 <pic:pic>
                   <pic:nvPicPr>
-                    <pic:cNvPr id="0" name="image18.png"/>
+                    <pic:cNvPr id="0" name="image28.png"/>
                     <pic:cNvPicPr preferRelativeResize="0"/>
                   </pic:nvPicPr>
                   <pic:blipFill>
@@ -3785,7 +3785,7 @@
           <wp:inline distB="114300" distT="114300" distL="114300" distR="114300">
             <wp:extent cx="6210960" cy="469900"/>
             <wp:effectExtent b="12700" l="12700" r="12700" t="12700"/>
-            <wp:docPr id="13" name="image25.png"/>
+            <wp:docPr id="8" name="image25.png"/>
             <a:graphic>
               <a:graphicData uri="http://schemas.openxmlformats.org/drawingml/2006/picture">
                 <pic:pic>
@@ -5578,9 +5578,741 @@
           <w:iCs w:val="1"/>
           <w:sz w:val="24"/>
           <w:szCs w:val="24"/>
-          <w:rtl w:val="0"/>
-        </w:rPr>
-        <w:t xml:space="preserve">рис. до блок-схем 1-15</w:t>
+        </w:rPr>
+        <w:drawing>
+          <wp:inline distB="114300" distT="114300" distL="114300" distR="114300">
+            <wp:extent cx="4495800" cy="3914775"/>
+            <wp:effectExtent b="0" l="0" r="0" t="0"/>
+            <wp:docPr id="26" name="image21.png"/>
+            <a:graphic>
+              <a:graphicData uri="http://schemas.openxmlformats.org/drawingml/2006/picture">
+                <pic:pic>
+                  <pic:nvPicPr>
+                    <pic:cNvPr id="0" name="image21.png"/>
+                    <pic:cNvPicPr preferRelativeResize="0"/>
+                  </pic:nvPicPr>
+                  <pic:blipFill>
+                    <a:blip r:embed="rId20"/>
+                    <a:srcRect b="0" l="0" r="0" t="0"/>
+                    <a:stretch>
+                      <a:fillRect/>
+                    </a:stretch>
+                  </pic:blipFill>
+                  <pic:spPr>
+                    <a:xfrm>
+                      <a:off x="0" y="0"/>
+                      <a:ext cx="4495800" cy="3914775"/>
+                    </a:xfrm>
+                    <a:prstGeom prst="rect"/>
+                    <a:ln/>
+                  </pic:spPr>
+                </pic:pic>
+              </a:graphicData>
+            </a:graphic>
+          </wp:inline>
+        </w:drawing>
+      </w:r>
+      <w:r>
+        <w:rPr>
+          <w:rFonts w:ascii="Times New Roman" w:cs="Times New Roman" w:eastAsia="Times New Roman" w:hAnsi="Times New Roman"/>
+          <w:i w:val="1"/>
+          <w:iCs w:val="1"/>
+          <w:sz w:val="24"/>
+          <w:szCs w:val="24"/>
+        </w:rPr>
+        <w:drawing>
+          <wp:inline distB="114300" distT="114300" distL="114300" distR="114300">
+            <wp:extent cx="6210960" cy="4800600"/>
+            <wp:effectExtent b="0" l="0" r="0" t="0"/>
+            <wp:docPr id="6" name="image3.png"/>
+            <a:graphic>
+              <a:graphicData uri="http://schemas.openxmlformats.org/drawingml/2006/picture">
+                <pic:pic>
+                  <pic:nvPicPr>
+                    <pic:cNvPr id="0" name="image3.png"/>
+                    <pic:cNvPicPr preferRelativeResize="0"/>
+                  </pic:nvPicPr>
+                  <pic:blipFill>
+                    <a:blip r:embed="rId21"/>
+                    <a:srcRect b="0" l="0" r="0" t="0"/>
+                    <a:stretch>
+                      <a:fillRect/>
+                    </a:stretch>
+                  </pic:blipFill>
+                  <pic:spPr>
+                    <a:xfrm>
+                      <a:off x="0" y="0"/>
+                      <a:ext cx="6210960" cy="4800600"/>
+                    </a:xfrm>
+                    <a:prstGeom prst="rect"/>
+                    <a:ln/>
+                  </pic:spPr>
+                </pic:pic>
+              </a:graphicData>
+            </a:graphic>
+          </wp:inline>
+        </w:drawing>
+      </w:r>
+      <w:r>
+        <w:rPr>
+          <w:rFonts w:ascii="Times New Roman" w:cs="Times New Roman" w:eastAsia="Times New Roman" w:hAnsi="Times New Roman"/>
+          <w:i w:val="1"/>
+          <w:iCs w:val="1"/>
+          <w:sz w:val="24"/>
+          <w:szCs w:val="24"/>
+        </w:rPr>
+        <w:drawing>
+          <wp:inline distB="114300" distT="114300" distL="114300" distR="114300">
+            <wp:extent cx="5238750" cy="3838575"/>
+            <wp:effectExtent b="0" l="0" r="0" t="0"/>
+            <wp:docPr id="13" name="image10.png"/>
+            <a:graphic>
+              <a:graphicData uri="http://schemas.openxmlformats.org/drawingml/2006/picture">
+                <pic:pic>
+                  <pic:nvPicPr>
+                    <pic:cNvPr id="0" name="image10.png"/>
+                    <pic:cNvPicPr preferRelativeResize="0"/>
+                  </pic:nvPicPr>
+                  <pic:blipFill>
+                    <a:blip r:embed="rId22"/>
+                    <a:srcRect b="0" l="0" r="0" t="0"/>
+                    <a:stretch>
+                      <a:fillRect/>
+                    </a:stretch>
+                  </pic:blipFill>
+                  <pic:spPr>
+                    <a:xfrm>
+                      <a:off x="0" y="0"/>
+                      <a:ext cx="5238750" cy="3838575"/>
+                    </a:xfrm>
+                    <a:prstGeom prst="rect"/>
+                    <a:ln/>
+                  </pic:spPr>
+                </pic:pic>
+              </a:graphicData>
+            </a:graphic>
+          </wp:inline>
+        </w:drawing>
+      </w:r>
+      <w:r>
+        <w:rPr>
+          <w:rFonts w:ascii="Times New Roman" w:cs="Times New Roman" w:eastAsia="Times New Roman" w:hAnsi="Times New Roman"/>
+          <w:i w:val="1"/>
+          <w:iCs w:val="1"/>
+          <w:sz w:val="24"/>
+          <w:szCs w:val="24"/>
+        </w:rPr>
+        <w:drawing>
+          <wp:inline distB="114300" distT="114300" distL="114300" distR="114300">
+            <wp:extent cx="6210960" cy="6223000"/>
+            <wp:effectExtent b="0" l="0" r="0" t="0"/>
+            <wp:docPr id="4" name="image15.png"/>
+            <a:graphic>
+              <a:graphicData uri="http://schemas.openxmlformats.org/drawingml/2006/picture">
+                <pic:pic>
+                  <pic:nvPicPr>
+                    <pic:cNvPr id="0" name="image15.png"/>
+                    <pic:cNvPicPr preferRelativeResize="0"/>
+                  </pic:nvPicPr>
+                  <pic:blipFill>
+                    <a:blip r:embed="rId23"/>
+                    <a:srcRect b="0" l="0" r="0" t="0"/>
+                    <a:stretch>
+                      <a:fillRect/>
+                    </a:stretch>
+                  </pic:blipFill>
+                  <pic:spPr>
+                    <a:xfrm>
+                      <a:off x="0" y="0"/>
+                      <a:ext cx="6210960" cy="6223000"/>
+                    </a:xfrm>
+                    <a:prstGeom prst="rect"/>
+                    <a:ln/>
+                  </pic:spPr>
+                </pic:pic>
+              </a:graphicData>
+            </a:graphic>
+          </wp:inline>
+        </w:drawing>
+      </w:r>
+      <w:r>
+        <w:rPr>
+          <w:rFonts w:ascii="Times New Roman" w:cs="Times New Roman" w:eastAsia="Times New Roman" w:hAnsi="Times New Roman"/>
+          <w:i w:val="1"/>
+          <w:iCs w:val="1"/>
+          <w:sz w:val="24"/>
+          <w:szCs w:val="24"/>
+        </w:rPr>
+        <w:drawing>
+          <wp:inline distB="114300" distT="114300" distL="114300" distR="114300">
+            <wp:extent cx="6210960" cy="4762500"/>
+            <wp:effectExtent b="0" l="0" r="0" t="0"/>
+            <wp:docPr id="18" name="image6.png"/>
+            <a:graphic>
+              <a:graphicData uri="http://schemas.openxmlformats.org/drawingml/2006/picture">
+                <pic:pic>
+                  <pic:nvPicPr>
+                    <pic:cNvPr id="0" name="image6.png"/>
+                    <pic:cNvPicPr preferRelativeResize="0"/>
+                  </pic:nvPicPr>
+                  <pic:blipFill>
+                    <a:blip r:embed="rId24"/>
+                    <a:srcRect b="0" l="0" r="0" t="0"/>
+                    <a:stretch>
+                      <a:fillRect/>
+                    </a:stretch>
+                  </pic:blipFill>
+                  <pic:spPr>
+                    <a:xfrm>
+                      <a:off x="0" y="0"/>
+                      <a:ext cx="6210960" cy="4762500"/>
+                    </a:xfrm>
+                    <a:prstGeom prst="rect"/>
+                    <a:ln/>
+                  </pic:spPr>
+                </pic:pic>
+              </a:graphicData>
+            </a:graphic>
+          </wp:inline>
+        </w:drawing>
+      </w:r>
+      <w:r>
+        <w:rPr>
+          <w:rFonts w:ascii="Times New Roman" w:cs="Times New Roman" w:eastAsia="Times New Roman" w:hAnsi="Times New Roman"/>
+          <w:i w:val="1"/>
+          <w:iCs w:val="1"/>
+          <w:sz w:val="24"/>
+          <w:szCs w:val="24"/>
+        </w:rPr>
+        <w:drawing>
+          <wp:inline distB="114300" distT="114300" distL="114300" distR="114300">
+            <wp:extent cx="6210960" cy="5003800"/>
+            <wp:effectExtent b="0" l="0" r="0" t="0"/>
+            <wp:docPr id="5" name="image7.png"/>
+            <a:graphic>
+              <a:graphicData uri="http://schemas.openxmlformats.org/drawingml/2006/picture">
+                <pic:pic>
+                  <pic:nvPicPr>
+                    <pic:cNvPr id="0" name="image7.png"/>
+                    <pic:cNvPicPr preferRelativeResize="0"/>
+                  </pic:nvPicPr>
+                  <pic:blipFill>
+                    <a:blip r:embed="rId25"/>
+                    <a:srcRect b="0" l="0" r="0" t="0"/>
+                    <a:stretch>
+                      <a:fillRect/>
+                    </a:stretch>
+                  </pic:blipFill>
+                  <pic:spPr>
+                    <a:xfrm>
+                      <a:off x="0" y="0"/>
+                      <a:ext cx="6210960" cy="5003800"/>
+                    </a:xfrm>
+                    <a:prstGeom prst="rect"/>
+                    <a:ln/>
+                  </pic:spPr>
+                </pic:pic>
+              </a:graphicData>
+            </a:graphic>
+          </wp:inline>
+        </w:drawing>
+      </w:r>
+      <w:r>
+        <w:rPr>
+          <w:rFonts w:ascii="Times New Roman" w:cs="Times New Roman" w:eastAsia="Times New Roman" w:hAnsi="Times New Roman"/>
+          <w:i w:val="1"/>
+          <w:iCs w:val="1"/>
+          <w:sz w:val="24"/>
+          <w:szCs w:val="24"/>
+        </w:rPr>
+        <w:drawing>
+          <wp:inline distB="114300" distT="114300" distL="114300" distR="114300">
+            <wp:extent cx="6029325" cy="4429125"/>
+            <wp:effectExtent b="0" l="0" r="0" t="0"/>
+            <wp:docPr id="27" name="image22.png"/>
+            <a:graphic>
+              <a:graphicData uri="http://schemas.openxmlformats.org/drawingml/2006/picture">
+                <pic:pic>
+                  <pic:nvPicPr>
+                    <pic:cNvPr id="0" name="image22.png"/>
+                    <pic:cNvPicPr preferRelativeResize="0"/>
+                  </pic:nvPicPr>
+                  <pic:blipFill>
+                    <a:blip r:embed="rId26"/>
+                    <a:srcRect b="0" l="0" r="0" t="0"/>
+                    <a:stretch>
+                      <a:fillRect/>
+                    </a:stretch>
+                  </pic:blipFill>
+                  <pic:spPr>
+                    <a:xfrm>
+                      <a:off x="0" y="0"/>
+                      <a:ext cx="6029325" cy="4429125"/>
+                    </a:xfrm>
+                    <a:prstGeom prst="rect"/>
+                    <a:ln/>
+                  </pic:spPr>
+                </pic:pic>
+              </a:graphicData>
+            </a:graphic>
+          </wp:inline>
+        </w:drawing>
+      </w:r>
+      <w:r>
+        <w:rPr>
+          <w:rFonts w:ascii="Times New Roman" w:cs="Times New Roman" w:eastAsia="Times New Roman" w:hAnsi="Times New Roman"/>
+          <w:i w:val="1"/>
+          <w:iCs w:val="1"/>
+          <w:sz w:val="24"/>
+          <w:szCs w:val="24"/>
+        </w:rPr>
+        <w:drawing>
+          <wp:inline distB="114300" distT="114300" distL="114300" distR="114300">
+            <wp:extent cx="5410200" cy="2733675"/>
+            <wp:effectExtent b="0" l="0" r="0" t="0"/>
+            <wp:docPr id="25" name="image16.png"/>
+            <a:graphic>
+              <a:graphicData uri="http://schemas.openxmlformats.org/drawingml/2006/picture">
+                <pic:pic>
+                  <pic:nvPicPr>
+                    <pic:cNvPr id="0" name="image16.png"/>
+                    <pic:cNvPicPr preferRelativeResize="0"/>
+                  </pic:nvPicPr>
+                  <pic:blipFill>
+                    <a:blip r:embed="rId27"/>
+                    <a:srcRect b="0" l="0" r="0" t="0"/>
+                    <a:stretch>
+                      <a:fillRect/>
+                    </a:stretch>
+                  </pic:blipFill>
+                  <pic:spPr>
+                    <a:xfrm>
+                      <a:off x="0" y="0"/>
+                      <a:ext cx="5410200" cy="2733675"/>
+                    </a:xfrm>
+                    <a:prstGeom prst="rect"/>
+                    <a:ln/>
+                  </pic:spPr>
+                </pic:pic>
+              </a:graphicData>
+            </a:graphic>
+          </wp:inline>
+        </w:drawing>
+      </w:r>
+      <w:r>
+        <w:rPr>
+          <w:rFonts w:ascii="Times New Roman" w:cs="Times New Roman" w:eastAsia="Times New Roman" w:hAnsi="Times New Roman"/>
+          <w:i w:val="1"/>
+          <w:iCs w:val="1"/>
+          <w:sz w:val="24"/>
+          <w:szCs w:val="24"/>
+        </w:rPr>
+        <w:drawing>
+          <wp:inline distB="114300" distT="114300" distL="114300" distR="114300">
+            <wp:extent cx="6210960" cy="5918200"/>
+            <wp:effectExtent b="0" l="0" r="0" t="0"/>
+            <wp:docPr id="21" name="image17.png"/>
+            <a:graphic>
+              <a:graphicData uri="http://schemas.openxmlformats.org/drawingml/2006/picture">
+                <pic:pic>
+                  <pic:nvPicPr>
+                    <pic:cNvPr id="0" name="image17.png"/>
+                    <pic:cNvPicPr preferRelativeResize="0"/>
+                  </pic:nvPicPr>
+                  <pic:blipFill>
+                    <a:blip r:embed="rId28"/>
+                    <a:srcRect b="0" l="0" r="0" t="0"/>
+                    <a:stretch>
+                      <a:fillRect/>
+                    </a:stretch>
+                  </pic:blipFill>
+                  <pic:spPr>
+                    <a:xfrm>
+                      <a:off x="0" y="0"/>
+                      <a:ext cx="6210960" cy="5918200"/>
+                    </a:xfrm>
+                    <a:prstGeom prst="rect"/>
+                    <a:ln/>
+                  </pic:spPr>
+                </pic:pic>
+              </a:graphicData>
+            </a:graphic>
+          </wp:inline>
+        </w:drawing>
+      </w:r>
+      <w:r>
+        <w:rPr>
+          <w:rFonts w:ascii="Times New Roman" w:cs="Times New Roman" w:eastAsia="Times New Roman" w:hAnsi="Times New Roman"/>
+          <w:i w:val="1"/>
+          <w:iCs w:val="1"/>
+          <w:sz w:val="24"/>
+          <w:szCs w:val="24"/>
+        </w:rPr>
+        <w:drawing>
+          <wp:inline distB="114300" distT="114300" distL="114300" distR="114300">
+            <wp:extent cx="6210960" cy="6769100"/>
+            <wp:effectExtent b="0" l="0" r="0" t="0"/>
+            <wp:docPr id="2" name="image1.png"/>
+            <a:graphic>
+              <a:graphicData uri="http://schemas.openxmlformats.org/drawingml/2006/picture">
+                <pic:pic>
+                  <pic:nvPicPr>
+                    <pic:cNvPr id="0" name="image1.png"/>
+                    <pic:cNvPicPr preferRelativeResize="0"/>
+                  </pic:nvPicPr>
+                  <pic:blipFill>
+                    <a:blip r:embed="rId29"/>
+                    <a:srcRect b="0" l="0" r="0" t="0"/>
+                    <a:stretch>
+                      <a:fillRect/>
+                    </a:stretch>
+                  </pic:blipFill>
+                  <pic:spPr>
+                    <a:xfrm>
+                      <a:off x="0" y="0"/>
+                      <a:ext cx="6210960" cy="6769100"/>
+                    </a:xfrm>
+                    <a:prstGeom prst="rect"/>
+                    <a:ln/>
+                  </pic:spPr>
+                </pic:pic>
+              </a:graphicData>
+            </a:graphic>
+          </wp:inline>
+        </w:drawing>
+      </w:r>
+      <w:r>
+        <w:rPr>
+          <w:rFonts w:ascii="Times New Roman" w:cs="Times New Roman" w:eastAsia="Times New Roman" w:hAnsi="Times New Roman"/>
+          <w:i w:val="1"/>
+          <w:iCs w:val="1"/>
+          <w:sz w:val="24"/>
+          <w:szCs w:val="24"/>
+        </w:rPr>
+        <w:drawing>
+          <wp:inline distB="114300" distT="114300" distL="114300" distR="114300">
+            <wp:extent cx="6210960" cy="5943600"/>
+            <wp:effectExtent b="0" l="0" r="0" t="0"/>
+            <wp:docPr id="20" name="image9.png"/>
+            <a:graphic>
+              <a:graphicData uri="http://schemas.openxmlformats.org/drawingml/2006/picture">
+                <pic:pic>
+                  <pic:nvPicPr>
+                    <pic:cNvPr id="0" name="image9.png"/>
+                    <pic:cNvPicPr preferRelativeResize="0"/>
+                  </pic:nvPicPr>
+                  <pic:blipFill>
+                    <a:blip r:embed="rId30"/>
+                    <a:srcRect b="0" l="0" r="0" t="0"/>
+                    <a:stretch>
+                      <a:fillRect/>
+                    </a:stretch>
+                  </pic:blipFill>
+                  <pic:spPr>
+                    <a:xfrm>
+                      <a:off x="0" y="0"/>
+                      <a:ext cx="6210960" cy="5943600"/>
+                    </a:xfrm>
+                    <a:prstGeom prst="rect"/>
+                    <a:ln/>
+                  </pic:spPr>
+                </pic:pic>
+              </a:graphicData>
+            </a:graphic>
+          </wp:inline>
+        </w:drawing>
+      </w:r>
+      <w:r>
+        <w:rPr>
+          <w:rFonts w:ascii="Times New Roman" w:cs="Times New Roman" w:eastAsia="Times New Roman" w:hAnsi="Times New Roman"/>
+          <w:i w:val="1"/>
+          <w:iCs w:val="1"/>
+          <w:sz w:val="24"/>
+          <w:szCs w:val="24"/>
+        </w:rPr>
+        <w:drawing>
+          <wp:inline distB="114300" distT="114300" distL="114300" distR="114300">
+            <wp:extent cx="6210960" cy="5003800"/>
+            <wp:effectExtent b="0" l="0" r="0" t="0"/>
+            <wp:docPr id="10" name="image5.png"/>
+            <a:graphic>
+              <a:graphicData uri="http://schemas.openxmlformats.org/drawingml/2006/picture">
+                <pic:pic>
+                  <pic:nvPicPr>
+                    <pic:cNvPr id="0" name="image5.png"/>
+                    <pic:cNvPicPr preferRelativeResize="0"/>
+                  </pic:nvPicPr>
+                  <pic:blipFill>
+                    <a:blip r:embed="rId31"/>
+                    <a:srcRect b="0" l="0" r="0" t="0"/>
+                    <a:stretch>
+                      <a:fillRect/>
+                    </a:stretch>
+                  </pic:blipFill>
+                  <pic:spPr>
+                    <a:xfrm>
+                      <a:off x="0" y="0"/>
+                      <a:ext cx="6210960" cy="5003800"/>
+                    </a:xfrm>
+                    <a:prstGeom prst="rect"/>
+                    <a:ln/>
+                  </pic:spPr>
+                </pic:pic>
+              </a:graphicData>
+            </a:graphic>
+          </wp:inline>
+        </w:drawing>
+      </w:r>
+      <w:r>
+        <w:rPr>
+          <w:rFonts w:ascii="Times New Roman" w:cs="Times New Roman" w:eastAsia="Times New Roman" w:hAnsi="Times New Roman"/>
+          <w:i w:val="1"/>
+          <w:iCs w:val="1"/>
+          <w:sz w:val="24"/>
+          <w:szCs w:val="24"/>
+        </w:rPr>
+        <w:drawing>
+          <wp:inline distB="114300" distT="114300" distL="114300" distR="114300">
+            <wp:extent cx="6210960" cy="3327400"/>
+            <wp:effectExtent b="0" l="0" r="0" t="0"/>
+            <wp:docPr id="9" name="image8.png"/>
+            <a:graphic>
+              <a:graphicData uri="http://schemas.openxmlformats.org/drawingml/2006/picture">
+                <pic:pic>
+                  <pic:nvPicPr>
+                    <pic:cNvPr id="0" name="image8.png"/>
+                    <pic:cNvPicPr preferRelativeResize="0"/>
+                  </pic:nvPicPr>
+                  <pic:blipFill>
+                    <a:blip r:embed="rId32"/>
+                    <a:srcRect b="0" l="0" r="0" t="0"/>
+                    <a:stretch>
+                      <a:fillRect/>
+                    </a:stretch>
+                  </pic:blipFill>
+                  <pic:spPr>
+                    <a:xfrm>
+                      <a:off x="0" y="0"/>
+                      <a:ext cx="6210960" cy="3327400"/>
+                    </a:xfrm>
+                    <a:prstGeom prst="rect"/>
+                    <a:ln/>
+                  </pic:spPr>
+                </pic:pic>
+              </a:graphicData>
+            </a:graphic>
+          </wp:inline>
+        </w:drawing>
+      </w:r>
+      <w:r>
+        <w:rPr>
+          <w:rFonts w:ascii="Times New Roman" w:cs="Times New Roman" w:eastAsia="Times New Roman" w:hAnsi="Times New Roman"/>
+          <w:i w:val="1"/>
+          <w:iCs w:val="1"/>
+          <w:sz w:val="24"/>
+          <w:szCs w:val="24"/>
+        </w:rPr>
+        <w:drawing>
+          <wp:inline distB="114300" distT="114300" distL="114300" distR="114300">
+            <wp:extent cx="5305425" cy="5391150"/>
+            <wp:effectExtent b="0" l="0" r="0" t="0"/>
+            <wp:docPr id="24" name="image20.png"/>
+            <a:graphic>
+              <a:graphicData uri="http://schemas.openxmlformats.org/drawingml/2006/picture">
+                <pic:pic>
+                  <pic:nvPicPr>
+                    <pic:cNvPr id="0" name="image20.png"/>
+                    <pic:cNvPicPr preferRelativeResize="0"/>
+                  </pic:nvPicPr>
+                  <pic:blipFill>
+                    <a:blip r:embed="rId33"/>
+                    <a:srcRect b="0" l="0" r="0" t="0"/>
+                    <a:stretch>
+                      <a:fillRect/>
+                    </a:stretch>
+                  </pic:blipFill>
+                  <pic:spPr>
+                    <a:xfrm>
+                      <a:off x="0" y="0"/>
+                      <a:ext cx="5305425" cy="5391150"/>
+                    </a:xfrm>
+                    <a:prstGeom prst="rect"/>
+                    <a:ln/>
+                  </pic:spPr>
+                </pic:pic>
+              </a:graphicData>
+            </a:graphic>
+          </wp:inline>
+        </w:drawing>
+      </w:r>
+      <w:r>
+        <w:rPr>
+          <w:rFonts w:ascii="Times New Roman" w:cs="Times New Roman" w:eastAsia="Times New Roman" w:hAnsi="Times New Roman"/>
+          <w:i w:val="1"/>
+          <w:iCs w:val="1"/>
+          <w:sz w:val="24"/>
+          <w:szCs w:val="24"/>
+        </w:rPr>
+        <w:drawing>
+          <wp:inline distB="114300" distT="114300" distL="114300" distR="114300">
+            <wp:extent cx="6210960" cy="6654800"/>
+            <wp:effectExtent b="0" l="0" r="0" t="0"/>
+            <wp:docPr id="22" name="image19.png"/>
+            <a:graphic>
+              <a:graphicData uri="http://schemas.openxmlformats.org/drawingml/2006/picture">
+                <pic:pic>
+                  <pic:nvPicPr>
+                    <pic:cNvPr id="0" name="image19.png"/>
+                    <pic:cNvPicPr preferRelativeResize="0"/>
+                  </pic:nvPicPr>
+                  <pic:blipFill>
+                    <a:blip r:embed="rId34"/>
+                    <a:srcRect b="0" l="0" r="0" t="0"/>
+                    <a:stretch>
+                      <a:fillRect/>
+                    </a:stretch>
+                  </pic:blipFill>
+                  <pic:spPr>
+                    <a:xfrm>
+                      <a:off x="0" y="0"/>
+                      <a:ext cx="6210960" cy="6654800"/>
+                    </a:xfrm>
+                    <a:prstGeom prst="rect"/>
+                    <a:ln/>
+                  </pic:spPr>
+                </pic:pic>
+              </a:graphicData>
+            </a:graphic>
+          </wp:inline>
+        </w:drawing>
+      </w:r>
+      <w:r>
+        <w:rPr>
+          <w:rFonts w:ascii="Times New Roman" w:cs="Times New Roman" w:eastAsia="Times New Roman" w:hAnsi="Times New Roman"/>
+          <w:i w:val="1"/>
+          <w:iCs w:val="1"/>
+          <w:sz w:val="24"/>
+          <w:szCs w:val="24"/>
+        </w:rPr>
+        <w:drawing>
+          <wp:inline distB="114300" distT="114300" distL="114300" distR="114300">
+            <wp:extent cx="6210960" cy="3721100"/>
+            <wp:effectExtent b="0" l="0" r="0" t="0"/>
+            <wp:docPr id="3" name="image2.png"/>
+            <a:graphic>
+              <a:graphicData uri="http://schemas.openxmlformats.org/drawingml/2006/picture">
+                <pic:pic>
+                  <pic:nvPicPr>
+                    <pic:cNvPr id="0" name="image2.png"/>
+                    <pic:cNvPicPr preferRelativeResize="0"/>
+                  </pic:nvPicPr>
+                  <pic:blipFill>
+                    <a:blip r:embed="rId35"/>
+                    <a:srcRect b="0" l="0" r="0" t="0"/>
+                    <a:stretch>
+                      <a:fillRect/>
+                    </a:stretch>
+                  </pic:blipFill>
+                  <pic:spPr>
+                    <a:xfrm>
+                      <a:off x="0" y="0"/>
+                      <a:ext cx="6210960" cy="3721100"/>
+                    </a:xfrm>
+                    <a:prstGeom prst="rect"/>
+                    <a:ln/>
+                  </pic:spPr>
+                </pic:pic>
+              </a:graphicData>
+            </a:graphic>
+          </wp:inline>
+        </w:drawing>
+      </w:r>
+      <w:r>
+        <w:rPr>
+          <w:rFonts w:ascii="Times New Roman" w:cs="Times New Roman" w:eastAsia="Times New Roman" w:hAnsi="Times New Roman"/>
+          <w:i w:val="1"/>
+          <w:iCs w:val="1"/>
+          <w:sz w:val="24"/>
+          <w:szCs w:val="24"/>
+        </w:rPr>
+        <w:drawing>
+          <wp:inline distB="114300" distT="114300" distL="114300" distR="114300">
+            <wp:extent cx="6210960" cy="4483100"/>
+            <wp:effectExtent b="0" l="0" r="0" t="0"/>
+            <wp:docPr id="11" name="image4.png"/>
+            <a:graphic>
+              <a:graphicData uri="http://schemas.openxmlformats.org/drawingml/2006/picture">
+                <pic:pic>
+                  <pic:nvPicPr>
+                    <pic:cNvPr id="0" name="image4.png"/>
+                    <pic:cNvPicPr preferRelativeResize="0"/>
+                  </pic:nvPicPr>
+                  <pic:blipFill>
+                    <a:blip r:embed="rId36"/>
+                    <a:srcRect b="0" l="0" r="0" t="0"/>
+                    <a:stretch>
+                      <a:fillRect/>
+                    </a:stretch>
+                  </pic:blipFill>
+                  <pic:spPr>
+                    <a:xfrm>
+                      <a:off x="0" y="0"/>
+                      <a:ext cx="6210960" cy="4483100"/>
+                    </a:xfrm>
+                    <a:prstGeom prst="rect"/>
+                    <a:ln/>
+                  </pic:spPr>
+                </pic:pic>
+              </a:graphicData>
+            </a:graphic>
+          </wp:inline>
+        </w:drawing>
+      </w:r>
+      <w:r>
+        <w:rPr>
+          <w:rFonts w:ascii="Times New Roman" w:cs="Times New Roman" w:eastAsia="Times New Roman" w:hAnsi="Times New Roman"/>
+          <w:i w:val="1"/>
+          <w:iCs w:val="1"/>
+          <w:sz w:val="24"/>
+          <w:szCs w:val="24"/>
+        </w:rPr>
+        <w:drawing>
+          <wp:inline distB="114300" distT="114300" distL="114300" distR="114300">
+            <wp:extent cx="6210960" cy="5334000"/>
+            <wp:effectExtent b="0" l="0" r="0" t="0"/>
+            <wp:docPr id="15" name="image11.png"/>
+            <a:graphic>
+              <a:graphicData uri="http://schemas.openxmlformats.org/drawingml/2006/picture">
+                <pic:pic>
+                  <pic:nvPicPr>
+                    <pic:cNvPr id="0" name="image11.png"/>
+                    <pic:cNvPicPr preferRelativeResize="0"/>
+                  </pic:nvPicPr>
+                  <pic:blipFill>
+                    <a:blip r:embed="rId37"/>
+                    <a:srcRect b="0" l="0" r="0" t="0"/>
+                    <a:stretch>
+                      <a:fillRect/>
+                    </a:stretch>
+                  </pic:blipFill>
+                  <pic:spPr>
+                    <a:xfrm>
+                      <a:off x="0" y="0"/>
+                      <a:ext cx="6210960" cy="5334000"/>
+                    </a:xfrm>
+                    <a:prstGeom prst="rect"/>
+                    <a:ln/>
+                  </pic:spPr>
+                </pic:pic>
+              </a:graphicData>
+            </a:graphic>
+          </wp:inline>
+        </w:drawing>
+      </w:r>
+      <w:r>
+        <w:rPr>
+          <w:rtl w:val="0"/>
+        </w:rPr>
       </w:r>
     </w:p>
     <w:p>
@@ -5635,708 +6367,6 @@
           <w:szCs w:val="24"/>
         </w:rPr>
       </w:pPr>
-      <w:r>
-        <w:rPr>
-          <w:rFonts w:ascii="Times New Roman" w:cs="Times New Roman" w:eastAsia="Times New Roman" w:hAnsi="Times New Roman"/>
-          <w:sz w:val="24"/>
-          <w:szCs w:val="24"/>
-        </w:rPr>
-        <w:drawing>
-          <wp:inline distB="114300" distT="114300" distL="114300" distR="114300">
-            <wp:extent cx="4733925" cy="7734300"/>
-            <wp:effectExtent b="0" l="0" r="0" t="0"/>
-            <wp:docPr id="9" name="image12.png"/>
-            <a:graphic>
-              <a:graphicData uri="http://schemas.openxmlformats.org/drawingml/2006/picture">
-                <pic:pic>
-                  <pic:nvPicPr>
-                    <pic:cNvPr id="0" name="image12.png"/>
-                    <pic:cNvPicPr preferRelativeResize="0"/>
-                  </pic:nvPicPr>
-                  <pic:blipFill>
-                    <a:blip r:embed="rId20"/>
-                    <a:srcRect b="0" l="0" r="0" t="0"/>
-                    <a:stretch>
-                      <a:fillRect/>
-                    </a:stretch>
-                  </pic:blipFill>
-                  <pic:spPr>
-                    <a:xfrm>
-                      <a:off x="0" y="0"/>
-                      <a:ext cx="4733925" cy="7734300"/>
-                    </a:xfrm>
-                    <a:prstGeom prst="rect"/>
-                    <a:ln/>
-                  </pic:spPr>
-                </pic:pic>
-              </a:graphicData>
-            </a:graphic>
-          </wp:inline>
-        </w:drawing>
-      </w:r>
-      <w:r>
-        <w:rPr>
-          <w:rFonts w:ascii="Times New Roman" w:cs="Times New Roman" w:eastAsia="Times New Roman" w:hAnsi="Times New Roman"/>
-          <w:sz w:val="24"/>
-          <w:szCs w:val="24"/>
-        </w:rPr>
-        <w:drawing>
-          <wp:inline distB="114300" distT="114300" distL="114300" distR="114300">
-            <wp:extent cx="2114550" cy="2876550"/>
-            <wp:effectExtent b="0" l="0" r="0" t="0"/>
-            <wp:docPr id="3" name="image7.png"/>
-            <a:graphic>
-              <a:graphicData uri="http://schemas.openxmlformats.org/drawingml/2006/picture">
-                <pic:pic>
-                  <pic:nvPicPr>
-                    <pic:cNvPr id="0" name="image7.png"/>
-                    <pic:cNvPicPr preferRelativeResize="0"/>
-                  </pic:nvPicPr>
-                  <pic:blipFill>
-                    <a:blip r:embed="rId21"/>
-                    <a:srcRect b="0" l="0" r="0" t="0"/>
-                    <a:stretch>
-                      <a:fillRect/>
-                    </a:stretch>
-                  </pic:blipFill>
-                  <pic:spPr>
-                    <a:xfrm>
-                      <a:off x="0" y="0"/>
-                      <a:ext cx="2114550" cy="2876550"/>
-                    </a:xfrm>
-                    <a:prstGeom prst="rect"/>
-                    <a:ln/>
-                  </pic:spPr>
-                </pic:pic>
-              </a:graphicData>
-            </a:graphic>
-          </wp:inline>
-        </w:drawing>
-      </w:r>
-      <w:r>
-        <w:rPr>
-          <w:rFonts w:ascii="Times New Roman" w:cs="Times New Roman" w:eastAsia="Times New Roman" w:hAnsi="Times New Roman"/>
-          <w:sz w:val="24"/>
-          <w:szCs w:val="24"/>
-        </w:rPr>
-        <w:drawing>
-          <wp:inline distB="114300" distT="114300" distL="114300" distR="114300">
-            <wp:extent cx="4048125" cy="2019300"/>
-            <wp:effectExtent b="0" l="0" r="0" t="0"/>
-            <wp:docPr id="5" name="image5.png"/>
-            <a:graphic>
-              <a:graphicData uri="http://schemas.openxmlformats.org/drawingml/2006/picture">
-                <pic:pic>
-                  <pic:nvPicPr>
-                    <pic:cNvPr id="0" name="image5.png"/>
-                    <pic:cNvPicPr preferRelativeResize="0"/>
-                  </pic:nvPicPr>
-                  <pic:blipFill>
-                    <a:blip r:embed="rId22"/>
-                    <a:srcRect b="0" l="0" r="0" t="0"/>
-                    <a:stretch>
-                      <a:fillRect/>
-                    </a:stretch>
-                  </pic:blipFill>
-                  <pic:spPr>
-                    <a:xfrm>
-                      <a:off x="0" y="0"/>
-                      <a:ext cx="4048125" cy="2019300"/>
-                    </a:xfrm>
-                    <a:prstGeom prst="rect"/>
-                    <a:ln/>
-                  </pic:spPr>
-                </pic:pic>
-              </a:graphicData>
-            </a:graphic>
-          </wp:inline>
-        </w:drawing>
-      </w:r>
-      <w:r>
-        <w:rPr>
-          <w:rFonts w:ascii="Times New Roman" w:cs="Times New Roman" w:eastAsia="Times New Roman" w:hAnsi="Times New Roman"/>
-          <w:sz w:val="24"/>
-          <w:szCs w:val="24"/>
-        </w:rPr>
-        <w:drawing>
-          <wp:inline distB="114300" distT="114300" distL="114300" distR="114300">
-            <wp:extent cx="4724400" cy="3876675"/>
-            <wp:effectExtent b="0" l="0" r="0" t="0"/>
-            <wp:docPr id="8" name="image27.png"/>
-            <a:graphic>
-              <a:graphicData uri="http://schemas.openxmlformats.org/drawingml/2006/picture">
-                <pic:pic>
-                  <pic:nvPicPr>
-                    <pic:cNvPr id="0" name="image27.png"/>
-                    <pic:cNvPicPr preferRelativeResize="0"/>
-                  </pic:nvPicPr>
-                  <pic:blipFill>
-                    <a:blip r:embed="rId23"/>
-                    <a:srcRect b="0" l="0" r="0" t="0"/>
-                    <a:stretch>
-                      <a:fillRect/>
-                    </a:stretch>
-                  </pic:blipFill>
-                  <pic:spPr>
-                    <a:xfrm>
-                      <a:off x="0" y="0"/>
-                      <a:ext cx="4724400" cy="3876675"/>
-                    </a:xfrm>
-                    <a:prstGeom prst="rect"/>
-                    <a:ln/>
-                  </pic:spPr>
-                </pic:pic>
-              </a:graphicData>
-            </a:graphic>
-          </wp:inline>
-        </w:drawing>
-      </w:r>
-      <w:r>
-        <w:rPr>
-          <w:rFonts w:ascii="Times New Roman" w:cs="Times New Roman" w:eastAsia="Times New Roman" w:hAnsi="Times New Roman"/>
-          <w:sz w:val="24"/>
-          <w:szCs w:val="24"/>
-        </w:rPr>
-        <w:drawing>
-          <wp:inline distB="114300" distT="114300" distL="114300" distR="114300">
-            <wp:extent cx="3629025" cy="3733800"/>
-            <wp:effectExtent b="0" l="0" r="0" t="0"/>
-            <wp:docPr id="16" name="image1.png"/>
-            <a:graphic>
-              <a:graphicData uri="http://schemas.openxmlformats.org/drawingml/2006/picture">
-                <pic:pic>
-                  <pic:nvPicPr>
-                    <pic:cNvPr id="0" name="image1.png"/>
-                    <pic:cNvPicPr preferRelativeResize="0"/>
-                  </pic:nvPicPr>
-                  <pic:blipFill>
-                    <a:blip r:embed="rId24"/>
-                    <a:srcRect b="0" l="0" r="0" t="0"/>
-                    <a:stretch>
-                      <a:fillRect/>
-                    </a:stretch>
-                  </pic:blipFill>
-                  <pic:spPr>
-                    <a:xfrm>
-                      <a:off x="0" y="0"/>
-                      <a:ext cx="3629025" cy="3733800"/>
-                    </a:xfrm>
-                    <a:prstGeom prst="rect"/>
-                    <a:ln/>
-                  </pic:spPr>
-                </pic:pic>
-              </a:graphicData>
-            </a:graphic>
-          </wp:inline>
-        </w:drawing>
-      </w:r>
-      <w:r>
-        <w:rPr>
-          <w:rFonts w:ascii="Times New Roman" w:cs="Times New Roman" w:eastAsia="Times New Roman" w:hAnsi="Times New Roman"/>
-          <w:sz w:val="24"/>
-          <w:szCs w:val="24"/>
-        </w:rPr>
-        <w:drawing>
-          <wp:inline distB="114300" distT="114300" distL="114300" distR="114300">
-            <wp:extent cx="4238625" cy="4448175"/>
-            <wp:effectExtent b="0" l="0" r="0" t="0"/>
-            <wp:docPr id="7" name="image15.png"/>
-            <a:graphic>
-              <a:graphicData uri="http://schemas.openxmlformats.org/drawingml/2006/picture">
-                <pic:pic>
-                  <pic:nvPicPr>
-                    <pic:cNvPr id="0" name="image15.png"/>
-                    <pic:cNvPicPr preferRelativeResize="0"/>
-                  </pic:nvPicPr>
-                  <pic:blipFill>
-                    <a:blip r:embed="rId25"/>
-                    <a:srcRect b="0" l="0" r="0" t="0"/>
-                    <a:stretch>
-                      <a:fillRect/>
-                    </a:stretch>
-                  </pic:blipFill>
-                  <pic:spPr>
-                    <a:xfrm>
-                      <a:off x="0" y="0"/>
-                      <a:ext cx="4238625" cy="4448175"/>
-                    </a:xfrm>
-                    <a:prstGeom prst="rect"/>
-                    <a:ln/>
-                  </pic:spPr>
-                </pic:pic>
-              </a:graphicData>
-            </a:graphic>
-          </wp:inline>
-        </w:drawing>
-      </w:r>
-      <w:r>
-        <w:rPr>
-          <w:rFonts w:ascii="Times New Roman" w:cs="Times New Roman" w:eastAsia="Times New Roman" w:hAnsi="Times New Roman"/>
-          <w:sz w:val="24"/>
-          <w:szCs w:val="24"/>
-        </w:rPr>
-        <w:drawing>
-          <wp:inline distB="114300" distT="114300" distL="114300" distR="114300">
-            <wp:extent cx="3162300" cy="4067175"/>
-            <wp:effectExtent b="0" l="0" r="0" t="0"/>
-            <wp:docPr id="18" name="image8.png"/>
-            <a:graphic>
-              <a:graphicData uri="http://schemas.openxmlformats.org/drawingml/2006/picture">
-                <pic:pic>
-                  <pic:nvPicPr>
-                    <pic:cNvPr id="0" name="image8.png"/>
-                    <pic:cNvPicPr preferRelativeResize="0"/>
-                  </pic:nvPicPr>
-                  <pic:blipFill>
-                    <a:blip r:embed="rId26"/>
-                    <a:srcRect b="0" l="0" r="0" t="0"/>
-                    <a:stretch>
-                      <a:fillRect/>
-                    </a:stretch>
-                  </pic:blipFill>
-                  <pic:spPr>
-                    <a:xfrm>
-                      <a:off x="0" y="0"/>
-                      <a:ext cx="3162300" cy="4067175"/>
-                    </a:xfrm>
-                    <a:prstGeom prst="rect"/>
-                    <a:ln/>
-                  </pic:spPr>
-                </pic:pic>
-              </a:graphicData>
-            </a:graphic>
-          </wp:inline>
-        </w:drawing>
-      </w:r>
-      <w:r>
-        <w:rPr>
-          <w:rFonts w:ascii="Times New Roman" w:cs="Times New Roman" w:eastAsia="Times New Roman" w:hAnsi="Times New Roman"/>
-          <w:sz w:val="24"/>
-          <w:szCs w:val="24"/>
-        </w:rPr>
-        <w:drawing>
-          <wp:inline distB="114300" distT="114300" distL="114300" distR="114300">
-            <wp:extent cx="2171700" cy="3429000"/>
-            <wp:effectExtent b="0" l="0" r="0" t="0"/>
-            <wp:docPr id="15" name="image4.png"/>
-            <a:graphic>
-              <a:graphicData uri="http://schemas.openxmlformats.org/drawingml/2006/picture">
-                <pic:pic>
-                  <pic:nvPicPr>
-                    <pic:cNvPr id="0" name="image4.png"/>
-                    <pic:cNvPicPr preferRelativeResize="0"/>
-                  </pic:nvPicPr>
-                  <pic:blipFill>
-                    <a:blip r:embed="rId27"/>
-                    <a:srcRect b="0" l="0" r="0" t="0"/>
-                    <a:stretch>
-                      <a:fillRect/>
-                    </a:stretch>
-                  </pic:blipFill>
-                  <pic:spPr>
-                    <a:xfrm>
-                      <a:off x="0" y="0"/>
-                      <a:ext cx="2171700" cy="3429000"/>
-                    </a:xfrm>
-                    <a:prstGeom prst="rect"/>
-                    <a:ln/>
-                  </pic:spPr>
-                </pic:pic>
-              </a:graphicData>
-            </a:graphic>
-          </wp:inline>
-        </w:drawing>
-      </w:r>
-      <w:r>
-        <w:rPr>
-          <w:rFonts w:ascii="Times New Roman" w:cs="Times New Roman" w:eastAsia="Times New Roman" w:hAnsi="Times New Roman"/>
-          <w:sz w:val="24"/>
-          <w:szCs w:val="24"/>
-        </w:rPr>
-        <w:drawing>
-          <wp:inline distB="114300" distT="114300" distL="114300" distR="114300">
-            <wp:extent cx="3352800" cy="5829300"/>
-            <wp:effectExtent b="0" l="0" r="0" t="0"/>
-            <wp:docPr id="4" name="image14.png"/>
-            <a:graphic>
-              <a:graphicData uri="http://schemas.openxmlformats.org/drawingml/2006/picture">
-                <pic:pic>
-                  <pic:nvPicPr>
-                    <pic:cNvPr id="0" name="image14.png"/>
-                    <pic:cNvPicPr preferRelativeResize="0"/>
-                  </pic:nvPicPr>
-                  <pic:blipFill>
-                    <a:blip r:embed="rId28"/>
-                    <a:srcRect b="0" l="0" r="0" t="0"/>
-                    <a:stretch>
-                      <a:fillRect/>
-                    </a:stretch>
-                  </pic:blipFill>
-                  <pic:spPr>
-                    <a:xfrm>
-                      <a:off x="0" y="0"/>
-                      <a:ext cx="3352800" cy="5829300"/>
-                    </a:xfrm>
-                    <a:prstGeom prst="rect"/>
-                    <a:ln/>
-                  </pic:spPr>
-                </pic:pic>
-              </a:graphicData>
-            </a:graphic>
-          </wp:inline>
-        </w:drawing>
-      </w:r>
-      <w:r>
-        <w:rPr>
-          <w:rFonts w:ascii="Times New Roman" w:cs="Times New Roman" w:eastAsia="Times New Roman" w:hAnsi="Times New Roman"/>
-          <w:sz w:val="24"/>
-          <w:szCs w:val="24"/>
-        </w:rPr>
-        <w:drawing>
-          <wp:inline distB="114300" distT="114300" distL="114300" distR="114300">
-            <wp:extent cx="4000500" cy="5391150"/>
-            <wp:effectExtent b="0" l="0" r="0" t="0"/>
-            <wp:docPr id="11" name="image6.png"/>
-            <a:graphic>
-              <a:graphicData uri="http://schemas.openxmlformats.org/drawingml/2006/picture">
-                <pic:pic>
-                  <pic:nvPicPr>
-                    <pic:cNvPr id="0" name="image6.png"/>
-                    <pic:cNvPicPr preferRelativeResize="0"/>
-                  </pic:nvPicPr>
-                  <pic:blipFill>
-                    <a:blip r:embed="rId29"/>
-                    <a:srcRect b="0" l="0" r="0" t="0"/>
-                    <a:stretch>
-                      <a:fillRect/>
-                    </a:stretch>
-                  </pic:blipFill>
-                  <pic:spPr>
-                    <a:xfrm>
-                      <a:off x="0" y="0"/>
-                      <a:ext cx="4000500" cy="5391150"/>
-                    </a:xfrm>
-                    <a:prstGeom prst="rect"/>
-                    <a:ln/>
-                  </pic:spPr>
-                </pic:pic>
-              </a:graphicData>
-            </a:graphic>
-          </wp:inline>
-        </w:drawing>
-      </w:r>
-      <w:r>
-        <w:rPr>
-          <w:rFonts w:ascii="Times New Roman" w:cs="Times New Roman" w:eastAsia="Times New Roman" w:hAnsi="Times New Roman"/>
-          <w:sz w:val="24"/>
-          <w:szCs w:val="24"/>
-        </w:rPr>
-        <w:drawing>
-          <wp:inline distB="114300" distT="114300" distL="114300" distR="114300">
-            <wp:extent cx="4171950" cy="6553200"/>
-            <wp:effectExtent b="0" l="0" r="0" t="0"/>
-            <wp:docPr id="17" name="image26.png"/>
-            <a:graphic>
-              <a:graphicData uri="http://schemas.openxmlformats.org/drawingml/2006/picture">
-                <pic:pic>
-                  <pic:nvPicPr>
-                    <pic:cNvPr id="0" name="image26.png"/>
-                    <pic:cNvPicPr preferRelativeResize="0"/>
-                  </pic:nvPicPr>
-                  <pic:blipFill>
-                    <a:blip r:embed="rId30"/>
-                    <a:srcRect b="0" l="0" r="0" t="0"/>
-                    <a:stretch>
-                      <a:fillRect/>
-                    </a:stretch>
-                  </pic:blipFill>
-                  <pic:spPr>
-                    <a:xfrm>
-                      <a:off x="0" y="0"/>
-                      <a:ext cx="4171950" cy="6553200"/>
-                    </a:xfrm>
-                    <a:prstGeom prst="rect"/>
-                    <a:ln/>
-                  </pic:spPr>
-                </pic:pic>
-              </a:graphicData>
-            </a:graphic>
-          </wp:inline>
-        </w:drawing>
-      </w:r>
-      <w:r>
-        <w:rPr>
-          <w:rFonts w:ascii="Times New Roman" w:cs="Times New Roman" w:eastAsia="Times New Roman" w:hAnsi="Times New Roman"/>
-          <w:sz w:val="24"/>
-          <w:szCs w:val="24"/>
-        </w:rPr>
-        <w:drawing>
-          <wp:inline distB="114300" distT="114300" distL="114300" distR="114300">
-            <wp:extent cx="6210960" cy="5384800"/>
-            <wp:effectExtent b="0" l="0" r="0" t="0"/>
-            <wp:docPr id="12" name="image21.png"/>
-            <a:graphic>
-              <a:graphicData uri="http://schemas.openxmlformats.org/drawingml/2006/picture">
-                <pic:pic>
-                  <pic:nvPicPr>
-                    <pic:cNvPr id="0" name="image21.png"/>
-                    <pic:cNvPicPr preferRelativeResize="0"/>
-                  </pic:nvPicPr>
-                  <pic:blipFill>
-                    <a:blip r:embed="rId31"/>
-                    <a:srcRect b="0" l="0" r="0" t="0"/>
-                    <a:stretch>
-                      <a:fillRect/>
-                    </a:stretch>
-                  </pic:blipFill>
-                  <pic:spPr>
-                    <a:xfrm>
-                      <a:off x="0" y="0"/>
-                      <a:ext cx="6210960" cy="5384800"/>
-                    </a:xfrm>
-                    <a:prstGeom prst="rect"/>
-                    <a:ln/>
-                  </pic:spPr>
-                </pic:pic>
-              </a:graphicData>
-            </a:graphic>
-          </wp:inline>
-        </w:drawing>
-      </w:r>
-      <w:r>
-        <w:rPr>
-          <w:rFonts w:ascii="Times New Roman" w:cs="Times New Roman" w:eastAsia="Times New Roman" w:hAnsi="Times New Roman"/>
-          <w:sz w:val="24"/>
-          <w:szCs w:val="24"/>
-        </w:rPr>
-        <w:drawing>
-          <wp:inline distB="114300" distT="114300" distL="114300" distR="114300">
-            <wp:extent cx="647700" cy="533400"/>
-            <wp:effectExtent b="0" l="0" r="0" t="0"/>
-            <wp:docPr id="21" name="image16.png"/>
-            <a:graphic>
-              <a:graphicData uri="http://schemas.openxmlformats.org/drawingml/2006/picture">
-                <pic:pic>
-                  <pic:nvPicPr>
-                    <pic:cNvPr id="0" name="image16.png"/>
-                    <pic:cNvPicPr preferRelativeResize="0"/>
-                  </pic:nvPicPr>
-                  <pic:blipFill>
-                    <a:blip r:embed="rId32"/>
-                    <a:srcRect b="0" l="0" r="0" t="0"/>
-                    <a:stretch>
-                      <a:fillRect/>
-                    </a:stretch>
-                  </pic:blipFill>
-                  <pic:spPr>
-                    <a:xfrm>
-                      <a:off x="0" y="0"/>
-                      <a:ext cx="647700" cy="533400"/>
-                    </a:xfrm>
-                    <a:prstGeom prst="rect"/>
-                    <a:ln/>
-                  </pic:spPr>
-                </pic:pic>
-              </a:graphicData>
-            </a:graphic>
-          </wp:inline>
-        </w:drawing>
-      </w:r>
-      <w:r>
-        <w:rPr>
-          <w:rFonts w:ascii="Times New Roman" w:cs="Times New Roman" w:eastAsia="Times New Roman" w:hAnsi="Times New Roman"/>
-          <w:sz w:val="24"/>
-          <w:szCs w:val="24"/>
-        </w:rPr>
-        <w:drawing>
-          <wp:inline distB="114300" distT="114300" distL="114300" distR="114300">
-            <wp:extent cx="4543425" cy="7534275"/>
-            <wp:effectExtent b="0" l="0" r="0" t="0"/>
-            <wp:docPr id="10" name="image2.png"/>
-            <a:graphic>
-              <a:graphicData uri="http://schemas.openxmlformats.org/drawingml/2006/picture">
-                <pic:pic>
-                  <pic:nvPicPr>
-                    <pic:cNvPr id="0" name="image2.png"/>
-                    <pic:cNvPicPr preferRelativeResize="0"/>
-                  </pic:nvPicPr>
-                  <pic:blipFill>
-                    <a:blip r:embed="rId33"/>
-                    <a:srcRect b="0" l="0" r="0" t="0"/>
-                    <a:stretch>
-                      <a:fillRect/>
-                    </a:stretch>
-                  </pic:blipFill>
-                  <pic:spPr>
-                    <a:xfrm>
-                      <a:off x="0" y="0"/>
-                      <a:ext cx="4543425" cy="7534275"/>
-                    </a:xfrm>
-                    <a:prstGeom prst="rect"/>
-                    <a:ln/>
-                  </pic:spPr>
-                </pic:pic>
-              </a:graphicData>
-            </a:graphic>
-          </wp:inline>
-        </w:drawing>
-      </w:r>
-      <w:r>
-        <w:rPr>
-          <w:rFonts w:ascii="Times New Roman" w:cs="Times New Roman" w:eastAsia="Times New Roman" w:hAnsi="Times New Roman"/>
-          <w:sz w:val="24"/>
-          <w:szCs w:val="24"/>
-        </w:rPr>
-        <w:drawing>
-          <wp:inline distB="114300" distT="114300" distL="114300" distR="114300">
-            <wp:extent cx="4791075" cy="6734175"/>
-            <wp:effectExtent b="0" l="0" r="0" t="0"/>
-            <wp:docPr id="14" name="image9.png"/>
-            <a:graphic>
-              <a:graphicData uri="http://schemas.openxmlformats.org/drawingml/2006/picture">
-                <pic:pic>
-                  <pic:nvPicPr>
-                    <pic:cNvPr id="0" name="image9.png"/>
-                    <pic:cNvPicPr preferRelativeResize="0"/>
-                  </pic:nvPicPr>
-                  <pic:blipFill>
-                    <a:blip r:embed="rId34"/>
-                    <a:srcRect b="0" l="0" r="0" t="0"/>
-                    <a:stretch>
-                      <a:fillRect/>
-                    </a:stretch>
-                  </pic:blipFill>
-                  <pic:spPr>
-                    <a:xfrm>
-                      <a:off x="0" y="0"/>
-                      <a:ext cx="4791075" cy="6734175"/>
-                    </a:xfrm>
-                    <a:prstGeom prst="rect"/>
-                    <a:ln/>
-                  </pic:spPr>
-                </pic:pic>
-              </a:graphicData>
-            </a:graphic>
-          </wp:inline>
-        </w:drawing>
-      </w:r>
-      <w:r>
-        <w:rPr>
-          <w:rFonts w:ascii="Times New Roman" w:cs="Times New Roman" w:eastAsia="Times New Roman" w:hAnsi="Times New Roman"/>
-          <w:sz w:val="24"/>
-          <w:szCs w:val="24"/>
-        </w:rPr>
-        <w:drawing>
-          <wp:inline distB="114300" distT="114300" distL="114300" distR="114300">
-            <wp:extent cx="3619500" cy="7639050"/>
-            <wp:effectExtent b="0" l="0" r="0" t="0"/>
-            <wp:docPr id="24" name="image17.png"/>
-            <a:graphic>
-              <a:graphicData uri="http://schemas.openxmlformats.org/drawingml/2006/picture">
-                <pic:pic>
-                  <pic:nvPicPr>
-                    <pic:cNvPr id="0" name="image17.png"/>
-                    <pic:cNvPicPr preferRelativeResize="0"/>
-                  </pic:nvPicPr>
-                  <pic:blipFill>
-                    <a:blip r:embed="rId35"/>
-                    <a:srcRect b="0" l="0" r="0" t="0"/>
-                    <a:stretch>
-                      <a:fillRect/>
-                    </a:stretch>
-                  </pic:blipFill>
-                  <pic:spPr>
-                    <a:xfrm>
-                      <a:off x="0" y="0"/>
-                      <a:ext cx="3619500" cy="7639050"/>
-                    </a:xfrm>
-                    <a:prstGeom prst="rect"/>
-                    <a:ln/>
-                  </pic:spPr>
-                </pic:pic>
-              </a:graphicData>
-            </a:graphic>
-          </wp:inline>
-        </w:drawing>
-      </w:r>
-      <w:r>
-        <w:rPr>
-          <w:rFonts w:ascii="Times New Roman" w:cs="Times New Roman" w:eastAsia="Times New Roman" w:hAnsi="Times New Roman"/>
-          <w:sz w:val="24"/>
-          <w:szCs w:val="24"/>
-        </w:rPr>
-        <w:drawing>
-          <wp:inline distB="114300" distT="114300" distL="114300" distR="114300">
-            <wp:extent cx="6210960" cy="3530600"/>
-            <wp:effectExtent b="0" l="0" r="0" t="0"/>
-            <wp:docPr id="2" name="image3.png"/>
-            <a:graphic>
-              <a:graphicData uri="http://schemas.openxmlformats.org/drawingml/2006/picture">
-                <pic:pic>
-                  <pic:nvPicPr>
-                    <pic:cNvPr id="0" name="image3.png"/>
-                    <pic:cNvPicPr preferRelativeResize="0"/>
-                  </pic:nvPicPr>
-                  <pic:blipFill>
-                    <a:blip r:embed="rId36"/>
-                    <a:srcRect b="0" l="0" r="0" t="0"/>
-                    <a:stretch>
-                      <a:fillRect/>
-                    </a:stretch>
-                  </pic:blipFill>
-                  <pic:spPr>
-                    <a:xfrm>
-                      <a:off x="0" y="0"/>
-                      <a:ext cx="6210960" cy="3530600"/>
-                    </a:xfrm>
-                    <a:prstGeom prst="rect"/>
-                    <a:ln/>
-                  </pic:spPr>
-                </pic:pic>
-              </a:graphicData>
-            </a:graphic>
-          </wp:inline>
-        </w:drawing>
-      </w:r>
-      <w:r>
-        <w:rPr>
-          <w:rFonts w:ascii="Times New Roman" w:cs="Times New Roman" w:eastAsia="Times New Roman" w:hAnsi="Times New Roman"/>
-          <w:sz w:val="24"/>
-          <w:szCs w:val="24"/>
-        </w:rPr>
-        <w:drawing>
-          <wp:inline distB="114300" distT="114300" distL="114300" distR="114300">
-            <wp:extent cx="6210960" cy="4318000"/>
-            <wp:effectExtent b="0" l="0" r="0" t="0"/>
-            <wp:docPr id="26" name="image24.png"/>
-            <a:graphic>
-              <a:graphicData uri="http://schemas.openxmlformats.org/drawingml/2006/picture">
-                <pic:pic>
-                  <pic:nvPicPr>
-                    <pic:cNvPr id="0" name="image24.png"/>
-                    <pic:cNvPicPr preferRelativeResize="0"/>
-                  </pic:nvPicPr>
-                  <pic:blipFill>
-                    <a:blip r:embed="rId37"/>
-                    <a:srcRect b="0" l="0" r="0" t="0"/>
-                    <a:stretch>
-                      <a:fillRect/>
-                    </a:stretch>
-                  </pic:blipFill>
-                  <pic:spPr>
-                    <a:xfrm>
-                      <a:off x="0" y="0"/>
-                      <a:ext cx="6210960" cy="4318000"/>
-                    </a:xfrm>
-                    <a:prstGeom prst="rect"/>
-                    <a:ln/>
-                  </pic:spPr>
-                </pic:pic>
-              </a:graphicData>
-            </a:graphic>
-          </wp:inline>
-        </w:drawing>
-      </w:r>
       <w:r>
         <w:rPr>
           <w:rtl w:val="0"/>
@@ -6451,7 +6481,25 @@
           <w:vertAlign w:val="baseline"/>
           <w:rtl w:val="0"/>
         </w:rPr>
-        <w:t xml:space="preserve">Планований час на реалізацію: </w:t>
+        <w:t xml:space="preserve">Планований</w:t>
+      </w:r>
+      <w:r>
+        <w:rPr>
+          <w:rFonts w:ascii="Times New Roman" w:cs="Times New Roman" w:eastAsia="Times New Roman" w:hAnsi="Times New Roman"/>
+          <w:b w:val="0"/>
+          <w:bCs w:val="0"/>
+          <w:i w:val="0"/>
+          <w:iCs w:val="0"/>
+          <w:smallCaps w:val="0"/>
+          <w:strike w:val="0"/>
+          <w:color w:val="000000"/>
+          <w:sz w:val="24"/>
+          <w:szCs w:val="24"/>
+          <w:u w:val="none"/>
+          <w:vertAlign w:val="baseline"/>
+          <w:rtl w:val="0"/>
+        </w:rPr>
+        <w:t xml:space="preserve"> час на реалізацію: </w:t>
       </w:r>
       <w:r>
         <w:rPr>
@@ -6554,12 +6602,12 @@
           <wp:inline distB="114300" distT="114300" distL="114300" distR="114300">
             <wp:extent cx="6210960" cy="5156200"/>
             <wp:effectExtent b="0" l="0" r="0" t="0"/>
-            <wp:docPr id="25" name="image19.png"/>
+            <wp:docPr id="23" name="image26.png"/>
             <a:graphic>
               <a:graphicData uri="http://schemas.openxmlformats.org/drawingml/2006/picture">
                 <pic:pic>
                   <pic:nvPicPr>
-                    <pic:cNvPr id="0" name="image19.png"/>
+                    <pic:cNvPr id="0" name="image26.png"/>
                     <pic:cNvPicPr preferRelativeResize="0"/>
                   </pic:nvPicPr>
                   <pic:blipFill>
@@ -6625,7 +6673,16 @@
           <w:szCs w:val="24"/>
           <w:rtl w:val="0"/>
         </w:rPr>
-        <w:t xml:space="preserve">Планований час на реалізацію: 40 хв</w:t>
+        <w:t xml:space="preserve">Планований</w:t>
+      </w:r>
+      <w:r>
+        <w:rPr>
+          <w:rFonts w:ascii="Times New Roman" w:cs="Times New Roman" w:eastAsia="Times New Roman" w:hAnsi="Times New Roman"/>
+          <w:sz w:val="24"/>
+          <w:szCs w:val="24"/>
+          <w:rtl w:val="0"/>
+        </w:rPr>
+        <w:t xml:space="preserve"> час на реалізацію: 40 хв</w:t>
       </w:r>
     </w:p>
     <w:p>
@@ -6683,7 +6740,16 @@
           <w:szCs w:val="24"/>
           <w:rtl w:val="0"/>
         </w:rPr>
-        <w:t xml:space="preserve">Планований час на реалізацію: 1 год</w:t>
+        <w:t xml:space="preserve">Планований</w:t>
+      </w:r>
+      <w:r>
+        <w:rPr>
+          <w:rFonts w:ascii="Times New Roman" w:cs="Times New Roman" w:eastAsia="Times New Roman" w:hAnsi="Times New Roman"/>
+          <w:sz w:val="24"/>
+          <w:szCs w:val="24"/>
+          <w:rtl w:val="0"/>
+        </w:rPr>
+        <w:t xml:space="preserve"> час на реалізацію: 1 год</w:t>
       </w:r>
     </w:p>
     <w:p>
@@ -6759,7 +6825,16 @@
           <w:szCs w:val="24"/>
           <w:rtl w:val="0"/>
         </w:rPr>
-        <w:t xml:space="preserve">Планований час на реалізацію: 1 год</w:t>
+        <w:t xml:space="preserve">Планований</w:t>
+      </w:r>
+      <w:r>
+        <w:rPr>
+          <w:rFonts w:ascii="Times New Roman" w:cs="Times New Roman" w:eastAsia="Times New Roman" w:hAnsi="Times New Roman"/>
+          <w:sz w:val="24"/>
+          <w:szCs w:val="24"/>
+          <w:rtl w:val="0"/>
+        </w:rPr>
+        <w:t xml:space="preserve"> час на реалізацію: 1 год</w:t>
       </w:r>
     </w:p>
     <w:p>
@@ -6835,7 +6910,16 @@
           <w:szCs w:val="24"/>
           <w:rtl w:val="0"/>
         </w:rPr>
-        <w:t xml:space="preserve">Планований час на реалізацію:  40 хв</w:t>
+        <w:t xml:space="preserve">Планований</w:t>
+      </w:r>
+      <w:r>
+        <w:rPr>
+          <w:rFonts w:ascii="Times New Roman" w:cs="Times New Roman" w:eastAsia="Times New Roman" w:hAnsi="Times New Roman"/>
+          <w:sz w:val="24"/>
+          <w:szCs w:val="24"/>
+          <w:rtl w:val="0"/>
+        </w:rPr>
+        <w:t xml:space="preserve"> час на реалізацію:  40 хв</w:t>
       </w:r>
     </w:p>
     <w:p>
@@ -6912,7 +6996,16 @@
           <w:szCs w:val="24"/>
           <w:rtl w:val="0"/>
         </w:rPr>
-        <w:t xml:space="preserve">Планований час на реалізацію: 40 хв</w:t>
+        <w:t xml:space="preserve">Планований</w:t>
+      </w:r>
+      <w:r>
+        <w:rPr>
+          <w:rFonts w:ascii="Times New Roman" w:cs="Times New Roman" w:eastAsia="Times New Roman" w:hAnsi="Times New Roman"/>
+          <w:sz w:val="24"/>
+          <w:szCs w:val="24"/>
+          <w:rtl w:val="0"/>
+        </w:rPr>
+        <w:t xml:space="preserve"> час на реалізацію: 40 хв</w:t>
       </w:r>
     </w:p>
     <w:p>
@@ -6989,7 +7082,16 @@
           <w:szCs w:val="24"/>
           <w:rtl w:val="0"/>
         </w:rPr>
-        <w:t xml:space="preserve">Планований час на реалізацію: 1 год</w:t>
+        <w:t xml:space="preserve">Планований</w:t>
+      </w:r>
+      <w:r>
+        <w:rPr>
+          <w:rFonts w:ascii="Times New Roman" w:cs="Times New Roman" w:eastAsia="Times New Roman" w:hAnsi="Times New Roman"/>
+          <w:sz w:val="24"/>
+          <w:szCs w:val="24"/>
+          <w:rtl w:val="0"/>
+        </w:rPr>
+        <w:t xml:space="preserve"> час на реалізацію: 1 год</w:t>
       </w:r>
     </w:p>
     <w:p>
@@ -33196,7 +33298,27 @@
           <w:szCs w:val="18"/>
           <w:rtl w:val="0"/>
         </w:rPr>
-        <w:t xml:space="preserve">/* Задача "Папероні"</w:t>
+        <w:t xml:space="preserve">/* Задача "</w:t>
+      </w:r>
+      <w:r>
+        <w:rPr>
+          <w:rFonts w:ascii="Consolas" w:cs="Consolas" w:eastAsia="Consolas" w:hAnsi="Consolas"/>
+          <w:color w:val="6a9955"/>
+          <w:sz w:val="18"/>
+          <w:szCs w:val="18"/>
+          <w:rtl w:val="0"/>
+        </w:rPr>
+        <w:t xml:space="preserve">Папероні</w:t>
+      </w:r>
+      <w:r>
+        <w:rPr>
+          <w:rFonts w:ascii="Consolas" w:cs="Consolas" w:eastAsia="Consolas" w:hAnsi="Consolas"/>
+          <w:color w:val="6a9955"/>
+          <w:sz w:val="18"/>
+          <w:szCs w:val="18"/>
+          <w:rtl w:val="0"/>
+        </w:rPr>
+        <w:t xml:space="preserve">"</w:t>
       </w:r>
     </w:p>
     <w:p>
@@ -37521,7 +37643,17 @@
           <w:szCs w:val="18"/>
           <w:rtl w:val="0"/>
         </w:rPr>
-        <w:t xml:space="preserve">++] = </w:t>
+        <w:t xml:space="preserve">++</w:t>
+      </w:r>
+      <w:r>
+        <w:rPr>
+          <w:rFonts w:ascii="Consolas" w:cs="Consolas" w:eastAsia="Consolas" w:hAnsi="Consolas"/>
+          <w:color w:val="d4d4d4"/>
+          <w:sz w:val="18"/>
+          <w:szCs w:val="18"/>
+          <w:rtl w:val="0"/>
+        </w:rPr>
+        <w:t xml:space="preserve">] = </w:t>
       </w:r>
       <w:r>
         <w:rPr>
@@ -42168,12 +42300,12 @@
           <wp:inline distB="114300" distT="114300" distL="114300" distR="114300">
             <wp:extent cx="3882847" cy="3504248"/>
             <wp:effectExtent b="0" l="0" r="0" t="0"/>
-            <wp:docPr id="1" name="image20.png"/>
+            <wp:docPr id="1" name="image29.png"/>
             <a:graphic>
               <a:graphicData uri="http://schemas.openxmlformats.org/drawingml/2006/picture">
                 <pic:pic>
                   <pic:nvPicPr>
-                    <pic:cNvPr id="0" name="image20.png"/>
+                    <pic:cNvPr id="0" name="image29.png"/>
                     <pic:cNvPicPr preferRelativeResize="0"/>
                   </pic:nvPicPr>
                   <pic:blipFill>
@@ -42218,14 +42350,8 @@
       </w:pPr>
       <w:r>
         <w:rPr>
-          <w:rFonts w:ascii="Times New Roman" w:cs="Times New Roman" w:eastAsia="Times New Roman" w:hAnsi="Times New Roman"/>
-          <w:i w:val="1"/>
-          <w:iCs w:val="1"/>
-          <w:sz w:val="24"/>
-          <w:szCs w:val="24"/>
-          <w:rtl w:val="0"/>
-        </w:rPr>
-        <w:t xml:space="preserve">рис. 1 робота програми “Аналізатор місячного бюджету”</w:t>
+          <w:rtl w:val="0"/>
+        </w:rPr>
       </w:r>
     </w:p>
     <w:p>
@@ -42247,12 +42373,12 @@
           <wp:inline distB="114300" distT="114300" distL="114300" distR="114300">
             <wp:extent cx="4619625" cy="7115175"/>
             <wp:effectExtent b="0" l="0" r="0" t="0"/>
-            <wp:docPr id="6" name="image13.png"/>
+            <wp:docPr id="7" name="image14.png"/>
             <a:graphic>
               <a:graphicData uri="http://schemas.openxmlformats.org/drawingml/2006/picture">
                 <pic:pic>
                   <pic:nvPicPr>
-                    <pic:cNvPr id="0" name="image13.png"/>
+                    <pic:cNvPr id="0" name="image14.png"/>
                     <pic:cNvPicPr preferRelativeResize="0"/>
                   </pic:nvPicPr>
                   <pic:blipFill>
@@ -42284,34 +42410,6 @@
     </w:p>
     <w:p>
       <w:pPr>
-        <w:spacing w:after="0" w:line="240" w:lineRule="auto"/>
-        <w:ind w:left="720" w:right="2835.1181102362207" w:firstLine="0"/>
-        <w:jc w:val="center"/>
-        <w:rPr>
-          <w:rFonts w:ascii="Times New Roman" w:cs="Times New Roman" w:eastAsia="Times New Roman" w:hAnsi="Times New Roman"/>
-          <w:sz w:val="24"/>
-          <w:szCs w:val="24"/>
-        </w:rPr>
-      </w:pPr>
-      <w:r>
-        <w:rPr>
-          <w:rFonts w:ascii="Times New Roman" w:cs="Times New Roman" w:eastAsia="Times New Roman" w:hAnsi="Times New Roman"/>
-          <w:i w:val="1"/>
-          <w:iCs w:val="1"/>
-          <w:sz w:val="24"/>
-          <w:szCs w:val="24"/>
-          <w:rtl w:val="0"/>
-        </w:rPr>
-        <w:t xml:space="preserve">рис. 2 робота програми “Аналізатор місячного бюджету”</w:t>
-      </w:r>
-      <w:r>
-        <w:rPr>
-          <w:rtl w:val="0"/>
-        </w:rPr>
-      </w:r>
-    </w:p>
-    <w:p>
-      <w:pPr>
         <w:spacing w:after="0" w:lineRule="auto"/>
         <w:rPr>
           <w:rFonts w:ascii="Times New Roman" w:cs="Times New Roman" w:eastAsia="Times New Roman" w:hAnsi="Times New Roman"/>
@@ -42393,12 +42491,12 @@
           <wp:inline distB="114300" distT="114300" distL="114300" distR="114300">
             <wp:extent cx="6210960" cy="647700"/>
             <wp:effectExtent b="0" l="0" r="0" t="0"/>
-            <wp:docPr id="19" name="image11.png"/>
+            <wp:docPr id="12" name="image27.png"/>
             <a:graphic>
               <a:graphicData uri="http://schemas.openxmlformats.org/drawingml/2006/picture">
                 <pic:pic>
                   <pic:nvPicPr>
-                    <pic:cNvPr id="0" name="image11.png"/>
+                    <pic:cNvPr id="0" name="image27.png"/>
                     <pic:cNvPicPr preferRelativeResize="0"/>
                   </pic:nvPicPr>
                   <pic:blipFill>
@@ -42431,43 +42529,6 @@
     <w:p>
       <w:pPr>
         <w:spacing w:after="0" w:line="240" w:lineRule="auto"/>
-        <w:ind w:right="-708.188976377952" w:firstLine="708.6614173228347"/>
-        <w:jc w:val="center"/>
-        <w:rPr>
-          <w:rFonts w:ascii="Times New Roman" w:cs="Times New Roman" w:eastAsia="Times New Roman" w:hAnsi="Times New Roman"/>
-          <w:sz w:val="24"/>
-          <w:szCs w:val="24"/>
-        </w:rPr>
-      </w:pPr>
-      <w:r>
-        <w:rPr>
-          <w:rFonts w:ascii="Times New Roman" w:cs="Times New Roman" w:eastAsia="Times New Roman" w:hAnsi="Times New Roman"/>
-          <w:sz w:val="24"/>
-          <w:szCs w:val="24"/>
-          <w:rtl w:val="0"/>
-        </w:rPr>
-        <w:t xml:space="preserve"> </w:t>
-      </w:r>
-      <w:r>
-        <w:rPr>
-          <w:rFonts w:ascii="Times New Roman" w:cs="Times New Roman" w:eastAsia="Times New Roman" w:hAnsi="Times New Roman"/>
-          <w:i w:val="1"/>
-          <w:iCs w:val="1"/>
-          <w:sz w:val="24"/>
-          <w:szCs w:val="24"/>
-          <w:rtl w:val="0"/>
-        </w:rPr>
-        <w:t xml:space="preserve">рис. 3 робота програми “Аналізатор місячного бюджету”</w:t>
-      </w:r>
-      <w:r>
-        <w:rPr>
-          <w:rtl w:val="0"/>
-        </w:rPr>
-      </w:r>
-    </w:p>
-    <w:p>
-      <w:pPr>
-        <w:spacing w:after="0" w:line="240" w:lineRule="auto"/>
         <w:rPr>
           <w:rFonts w:ascii="Times New Roman" w:cs="Times New Roman" w:eastAsia="Times New Roman" w:hAnsi="Times New Roman"/>
           <w:sz w:val="24"/>
@@ -42576,12 +42637,12 @@
           <wp:inline distB="114300" distT="114300" distL="114300" distR="114300">
             <wp:extent cx="4410075" cy="2781300"/>
             <wp:effectExtent b="0" l="0" r="0" t="0"/>
-            <wp:docPr id="22" name="image10.png"/>
+            <wp:docPr id="17" name="image18.png"/>
             <a:graphic>
               <a:graphicData uri="http://schemas.openxmlformats.org/drawingml/2006/picture">
                 <pic:pic>
                   <pic:nvPicPr>
-                    <pic:cNvPr id="0" name="image10.png"/>
+                    <pic:cNvPr id="0" name="image18.png"/>
                     <pic:cNvPicPr preferRelativeResize="0"/>
                   </pic:nvPicPr>
                   <pic:blipFill>
@@ -42613,58 +42674,6 @@
     </w:p>
     <w:p>
       <w:pPr>
-        <w:spacing w:after="0" w:line="240" w:lineRule="auto"/>
-        <w:ind w:right="2693.385826771655" w:firstLine="708.6614173228347"/>
-        <w:jc w:val="center"/>
-        <w:rPr>
-          <w:rFonts w:ascii="Times New Roman" w:cs="Times New Roman" w:eastAsia="Times New Roman" w:hAnsi="Times New Roman"/>
-          <w:sz w:val="24"/>
-          <w:szCs w:val="24"/>
-        </w:rPr>
-      </w:pPr>
-      <w:r>
-        <w:rPr>
-          <w:rFonts w:ascii="Times New Roman" w:cs="Times New Roman" w:eastAsia="Times New Roman" w:hAnsi="Times New Roman"/>
-          <w:sz w:val="24"/>
-          <w:szCs w:val="24"/>
-          <w:rtl w:val="0"/>
-        </w:rPr>
-        <w:t xml:space="preserve"> </w:t>
-      </w:r>
-      <w:r>
-        <w:rPr>
-          <w:rFonts w:ascii="Times New Roman" w:cs="Times New Roman" w:eastAsia="Times New Roman" w:hAnsi="Times New Roman"/>
-          <w:i w:val="1"/>
-          <w:iCs w:val="1"/>
-          <w:sz w:val="24"/>
-          <w:szCs w:val="24"/>
-          <w:rtl w:val="0"/>
-        </w:rPr>
-        <w:t xml:space="preserve">рис. 4 робота програми “Аналізатор місячного бюджету”</w:t>
-      </w:r>
-      <w:r>
-        <w:rPr>
-          <w:rtl w:val="0"/>
-        </w:rPr>
-      </w:r>
-    </w:p>
-    <w:p>
-      <w:pPr>
-        <w:spacing w:after="0" w:lineRule="auto"/>
-        <w:rPr>
-          <w:rFonts w:ascii="Times New Roman" w:cs="Times New Roman" w:eastAsia="Times New Roman" w:hAnsi="Times New Roman"/>
-          <w:sz w:val="24"/>
-          <w:szCs w:val="24"/>
-        </w:rPr>
-      </w:pPr>
-      <w:r>
-        <w:rPr>
-          <w:rtl w:val="0"/>
-        </w:rPr>
-      </w:r>
-    </w:p>
-    <w:p>
-      <w:pPr>
         <w:numPr>
           <w:ilvl w:val="0"/>
           <w:numId w:val="2"/>
@@ -42761,7 +42770,16 @@
           <w:szCs w:val="24"/>
           <w:rtl w:val="0"/>
         </w:rPr>
-        <w:t xml:space="preserve">Планований час на реалізацію:  40 хв</w:t>
+        <w:t xml:space="preserve">Планований</w:t>
+      </w:r>
+      <w:r>
+        <w:rPr>
+          <w:rFonts w:ascii="Times New Roman" w:cs="Times New Roman" w:eastAsia="Times New Roman" w:hAnsi="Times New Roman"/>
+          <w:sz w:val="24"/>
+          <w:szCs w:val="24"/>
+          <w:rtl w:val="0"/>
+        </w:rPr>
+        <w:t xml:space="preserve"> час на реалізацію:  40 хв</w:t>
       </w:r>
     </w:p>
     <w:p>
@@ -42838,7 +42856,16 @@
           <w:szCs w:val="24"/>
           <w:rtl w:val="0"/>
         </w:rPr>
-        <w:t xml:space="preserve">Планований час на реалізацію: 40 хв</w:t>
+        <w:t xml:space="preserve">Планований</w:t>
+      </w:r>
+      <w:r>
+        <w:rPr>
+          <w:rFonts w:ascii="Times New Roman" w:cs="Times New Roman" w:eastAsia="Times New Roman" w:hAnsi="Times New Roman"/>
+          <w:sz w:val="24"/>
+          <w:szCs w:val="24"/>
+          <w:rtl w:val="0"/>
+        </w:rPr>
+        <w:t xml:space="preserve"> час на реалізацію: 40 хв</w:t>
       </w:r>
     </w:p>
     <w:p>
@@ -42915,7 +42942,16 @@
           <w:szCs w:val="24"/>
           <w:rtl w:val="0"/>
         </w:rPr>
-        <w:t xml:space="preserve">Планований час на реалізацію: 1 год</w:t>
+        <w:t xml:space="preserve">Планований</w:t>
+      </w:r>
+      <w:r>
+        <w:rPr>
+          <w:rFonts w:ascii="Times New Roman" w:cs="Times New Roman" w:eastAsia="Times New Roman" w:hAnsi="Times New Roman"/>
+          <w:sz w:val="24"/>
+          <w:szCs w:val="24"/>
+          <w:rtl w:val="0"/>
+        </w:rPr>
+        <w:t xml:space="preserve"> час на реалізацію: 1 год</w:t>
       </w:r>
       <w:r>
         <w:rPr>
@@ -42966,12 +43002,12 @@
           <wp:inline distB="114300" distT="114300" distL="114300" distR="114300">
             <wp:extent cx="6210960" cy="2908300"/>
             <wp:effectExtent b="0" l="0" r="0" t="0"/>
-            <wp:docPr id="23" name="image23.png"/>
+            <wp:docPr id="19" name="image24.png"/>
             <a:graphic>
               <a:graphicData uri="http://schemas.openxmlformats.org/drawingml/2006/picture">
                 <pic:pic>
                   <pic:nvPicPr>
-                    <pic:cNvPr id="0" name="image23.png"/>
+                    <pic:cNvPr id="0" name="image24.png"/>
                     <pic:cNvPicPr preferRelativeResize="0"/>
                   </pic:nvPicPr>
                   <pic:blipFill>
@@ -43003,6 +43039,64 @@
     </w:p>
     <w:p>
       <w:pPr>
+        <w:ind w:left="0" w:firstLine="0"/>
+        <w:rPr/>
+      </w:pPr>
+      <w:r>
+        <w:rPr>
+          <w:rtl w:val="0"/>
+        </w:rPr>
+        <w:t xml:space="preserve">Прогрес Trello станом на 22.10</w:t>
+      </w:r>
+    </w:p>
+    <w:p>
+      <w:pPr>
+        <w:ind w:left="0" w:firstLine="0"/>
+        <w:rPr/>
+      </w:pPr>
+      <w:r>
+        <w:rPr/>
+        <w:drawing>
+          <wp:inline distB="114300" distT="114300" distL="114300" distR="114300">
+            <wp:extent cx="6210960" cy="3492500"/>
+            <wp:effectExtent b="0" l="0" r="0" t="0"/>
+            <wp:docPr id="16" name="image13.png"/>
+            <a:graphic>
+              <a:graphicData uri="http://schemas.openxmlformats.org/drawingml/2006/picture">
+                <pic:pic>
+                  <pic:nvPicPr>
+                    <pic:cNvPr id="0" name="image13.png"/>
+                    <pic:cNvPicPr preferRelativeResize="0"/>
+                  </pic:nvPicPr>
+                  <pic:blipFill>
+                    <a:blip r:embed="rId49"/>
+                    <a:srcRect b="0" l="0" r="0" t="0"/>
+                    <a:stretch>
+                      <a:fillRect/>
+                    </a:stretch>
+                  </pic:blipFill>
+                  <pic:spPr>
+                    <a:xfrm>
+                      <a:off x="0" y="0"/>
+                      <a:ext cx="6210960" cy="3492500"/>
+                    </a:xfrm>
+                    <a:prstGeom prst="rect"/>
+                    <a:ln/>
+                  </pic:spPr>
+                </pic:pic>
+              </a:graphicData>
+            </a:graphic>
+          </wp:inline>
+        </w:drawing>
+      </w:r>
+      <w:r>
+        <w:rPr>
+          <w:rtl w:val="0"/>
+        </w:rPr>
+      </w:r>
+    </w:p>
+    <w:p>
+      <w:pPr>
         <w:pStyle w:val="Heading1"/>
         <w:rPr>
           <w:rFonts w:ascii="Times New Roman" w:cs="Times New Roman" w:eastAsia="Times New Roman" w:hAnsi="Times New Roman"/>
@@ -43025,14 +43119,14 @@
     <w:p>
       <w:pPr>
         <w:rPr>
-          <w:sz w:val="24"/>
-          <w:szCs w:val="24"/>
-        </w:rPr>
-      </w:pPr>
-      <w:r>
-        <w:rPr>
-          <w:sz w:val="24"/>
-          <w:szCs w:val="24"/>
+          <w:sz w:val="26"/>
+          <w:szCs w:val="26"/>
+        </w:rPr>
+      </w:pPr>
+      <w:r>
+        <w:rPr>
+          <w:sz w:val="26"/>
+          <w:szCs w:val="26"/>
           <w:rtl w:val="0"/>
         </w:rPr>
         <w:t xml:space="preserve">Виконання роботи сприяло здобуттю теоретичних та практичних навичок з таким тем:</w:t>
@@ -43270,7 +43364,7 @@
           <w:szCs w:val="30"/>
           <w:rtl w:val="0"/>
         </w:rPr>
-        <w:t xml:space="preserve">Вдосконалення навичок роботи з інструментами: Trello, Git, GitHub, Linux bash, Algotester</w:t>
+        <w:t xml:space="preserve">Вдосконалення навичок роботи з інструментами: Trello, Git, GitHub, Linux bash, Algotester, Draw.io</w:t>
       </w:r>
       <w:r>
         <w:rPr>
@@ -43308,9 +43402,9 @@
       </w:r>
     </w:p>
     <w:sectPr>
-      <w:headerReference r:id="rId49" w:type="first"/>
-      <w:footerReference r:id="rId50" w:type="default"/>
-      <w:footerReference r:id="rId51" w:type="first"/>
+      <w:headerReference r:id="rId50" w:type="first"/>
+      <w:footerReference r:id="rId51" w:type="default"/>
+      <w:footerReference r:id="rId52" w:type="first"/>
       <w:pgSz w:h="16838" w:w="11906" w:orient="portrait"/>
       <w:pgMar w:bottom="1134" w:top="1134" w:left="1134" w:right="990.4724409448835" w:header="708" w:footer="708"/>
       <w:pgNumType w:start="1"/>

</xml_diff>